<commit_message>
Revise ISR draft: map public human benchmarks, position against Peng et al. mega-study
Co-Authored-By: Claude Sonnet 5.5 <noreply@anthropic.com>
Claude-Session: https://claude.ai/code/session_01UvKcabfwJpaPKKhavR8Tdw
</commit_message>
<xml_diff>
--- a/ISR_Digital_Twins_Behavioral_Econ_Paper_v3.docx
+++ b/ISR_Digital_Twins_Behavioral_Econ_Paper_v3.docx
@@ -117,7 +117,7 @@
           <w:sz w:val="24"/>
           <w:szCs w:val="24"/>
         </w:rPr>
-        <w:t xml:space="preserve">Existing evidence is encouraging but narrow. Studies show that LLMs can reproduce the qualitative direction of many classic laboratory findings (Aher et al. 2023, Horton et al. 2023) and that models fine-tuned on large behavioral corpora predict held-out participants (Binz et al. 2025). Directional recovery, however, is a weak standard for the uses IS scholars have in mind. A design scientist choosing between an opt-out and an opt-in enrollment flow needs to know how large the difference will be; a theorist testing a moderator needs the twin to reproduce the </w:t>
+        <w:t xml:space="preserve">Existing evidence is encouraging but narrow. Studies show that LLMs can reproduce the qualitative direction of many classic laboratory findings (Aher et al. 2023, Horton et al. 2023) and that models fine-tuned on large behavioral corpora predict held-out participants (Binz et al. 2025). Two recent efforts sharpen the concern. A pre-registered mega-study of 19 new human experiments and their twins found weak individual-level correspondence (average r = 0.20) and “hyper-rational” twins, and reported that twins showed a default effect for a classic paradigm but not for a less familiar one (Peng et al. 2026). Wang et al. (2026) argue that behavioral fidelity is neither necessary nor sufficient for twins to substitute for human data in valid inference. Directional recovery, however, is a weak standard for the uses IS scholars have in mind. A design scientist choosing between an opt-out and an opt-in enrollment flow needs to know how large the difference will be; a theorist testing a moderator needs the twin to reproduce the </w:t>
       </w:r>
       <w:r>
         <w:rPr>
@@ -149,7 +149,7 @@
           <w:sz w:val="24"/>
           <w:szCs w:val="24"/>
         </w:rPr>
-        <w:t xml:space="preserve">We therefore ask not whether twins can mimic humans, but whether they are </w:t>
+        <w:t xml:space="preserve">These studies establish that twins fall short on individual prediction, but they do not map fidelity onto theory, and they test few effects in more than one paradigm. We therefore ask not whether twins can mimic humans, but whether they are </w:t>
       </w:r>
       <w:r>
         <w:rPr>
@@ -367,7 +367,7 @@
           <w:sz w:val="24"/>
           <w:szCs w:val="24"/>
         </w:rPr>
-        <w:t xml:space="preserve">. They also say little about platform-specific stimuli, which differ in surface form from laboratory materials.</w:t>
+        <w:t xml:space="preserve">. They also say little about platform-specific stimuli, which differ in surface form from laboratory materials. The closest prior work is the mega-study of Peng et al. (2026), which evaluates twins built from Twin-2K-500 across 19 pre-registered human studies. It finds that twins are hyper-rational, fail to reproduce the attraction effect on newly built stimuli, and reproduce a default effect for a classic paradigm but not for a novel one. We build on these findings in three ways. We organize them around theory-derived hypotheses for six phenomena, we estimate magnitudes and moderator recovery and not only significance, and we add a formal, human-benchmarked contamination test, multiple model families and stages, and platform items.</w:t>
       </w:r>
     </w:p>
     <w:p>
@@ -764,15 +764,15 @@
           <w:sz w:val="24"/>
           <w:szCs w:val="24"/>
         </w:rPr>
-        <w:t xml:space="preserve">H1 (Direction with magnitude inflation).</w:t>
-      </w:r>
-      <w:r>
-        <w:rPr>
-          <w:rFonts w:ascii="Times New Roman" w:cs="Times New Roman" w:eastAsia="Times New Roman" w:hAnsi="Times New Roman"/>
-          <w:sz w:val="24"/>
-          <w:szCs w:val="24"/>
-        </w:rPr>
-        <w:t xml:space="preserve"> Twins will recover the sign of classic effects in at least 80% of phenomenon–model cells, but estimated magnitudes will exceed human benchmarks. </w:t>
+        <w:t xml:space="preserve">H1 (Direction, and magnitude that depends on familiarity).</w:t>
+      </w:r>
+      <w:r>
+        <w:rPr>
+          <w:rFonts w:ascii="Times New Roman" w:cs="Times New Roman" w:eastAsia="Times New Roman" w:hAnsi="Times New Roman"/>
+          <w:sz w:val="24"/>
+          <w:szCs w:val="24"/>
+        </w:rPr>
+        <w:t xml:space="preserve"> (a) Twins will recover the sign of classic effects in at least 80% of phenomenon–model cells. (b) Conditional on correct sign, estimated magnitudes on classic items will exceed human benchmarks. </w:t>
       </w:r>
       <w:r>
         <w:rPr>
@@ -790,7 +790,7 @@
           <w:sz w:val="24"/>
           <w:szCs w:val="24"/>
         </w:rPr>
-        <w:t xml:space="preserve"> text-trained models absorb the canonical, textbook form of each effect, which is typically reported at its most extreme (Section 2.2), and lack the noise and inattention that attenuate human responses.</w:t>
+        <w:t xml:space="preserve"> text-trained models absorb the canonical form of each effect, which is typically reported at its largest, and lack the noise and inattention that attenuate human responses (Section 2.2). Prior evidence warns that sign recovery is uneven: in Twin-2K-500, twins reproduced only 6 of 10 classic effects, and failed on those that require departing from normative answers, such as outcome bias, the Allais paradox, and omission bias (Toubia et al. 2025). We therefore treat 80% as a demanding benchmark and report cells separately for effects that depend on non-normative responses.</w:t>
       </w:r>
     </w:p>
     <w:p>
@@ -832,7 +832,7 @@
           <w:sz w:val="24"/>
           <w:szCs w:val="24"/>
         </w:rPr>
-        <w:t xml:space="preserve"> if recovery partly reflects memorization of surface form, it should not transfer fully to rewritten stimuli (Section 2.4).</w:t>
+        <w:t xml:space="preserve"> if recovery partly reflects memorization of surface form, it should not transfer fully to rewritten stimuli (Section 2.4). Peng et al. (2026) report consistent preliminary evidence for defaults, which we test across all six phenomena.</w:t>
       </w:r>
     </w:p>
     <w:p>
@@ -940,7 +940,7 @@
           <w:sz w:val="24"/>
           <w:szCs w:val="24"/>
         </w:rPr>
-        <w:t xml:space="preserve"> The rank order of platform design effects produced by twins will correlate positively with the meta-analytic rank order, but absolute twin effects will systematically fall outside meta-analytic confidence intervals, in the direction of overestimation. </w:t>
+        <w:t xml:space="preserve"> The rank order of platform design effects produced by twins will correlate positively with the meta-analytic rank order, but absolute twin effects will fall outside meta-analytic confidence intervals more often than the nominal rate. The direction of error is not constrained ex ante: overestimation is expected for canonical paradigms and underestimation for effects that require non-normative responses, and we report this as a pre-specified secondary analysis. </w:t>
       </w:r>
       <w:r>
         <w:rPr>
@@ -1275,7 +1275,920 @@
           <w:sz w:val="24"/>
           <w:szCs w:val="24"/>
         </w:rPr>
-        <w:t xml:space="preserve">No new human-subject data are collected. Item-level comparisons use Twin-2K-500 and Many Labs and other pre-registered replication datasets. Platform items are evaluated against pooled effect sizes and confidence intervals from published field experiments and meta-analyses (for example, Jachimowicz et al. 2019 for defaults). All benchmark sources are public and are listed with versions in Appendix C, and all prompts, model outputs, and code will be deposited in a public repository to allow replication.</w:t>
+        <w:t xml:space="preserve">No new human-subject data are collected. Table 2 maps each phenomenon to its public human benchmarks. Item-level benchmarks come from two public datasets: Twin-2K-500, whose 2,058 US participants completed four waves, including classic heuristics-and-biases experiments and a repeat wave that provides a human test–retest ceiling (Toubia et al. 2025), and the Twin-2K-500 mega-study, whose 19 pre-registered studies collected new human responses after the twins were built, including studies of the attraction effect, defaults, and fairness (Peng et al. 2026). The mega-study’s human data are particularly valuable for contamination because they come from stimuli, such as newly developed choice sets, that twins could not have seen during training. Replication datasets from Many Labs (Klein et al. 2014, 2018) and published meta-analyses supply additional benchmarks for classic effects, and platform items are evaluated against pooled effect sizes and confidence intervals from field experiments and meta-analyses (for example, Jachimowicz et al. 2019 for defaults). Benchmarks are matched to cells only when the paradigm can be mapped, and every source is listed with its version in Appendix C. All prompts, model outputs, and code will be deposited in a public repository.</w:t>
+      </w:r>
+    </w:p>
+    <w:p>
+      <w:pPr>
+        <w:keepNext/>
+        <w:spacing w:after="80" w:before="120"/>
+      </w:pPr>
+      <w:r>
+        <w:rPr>
+          <w:rFonts w:ascii="Times New Roman" w:cs="Times New Roman" w:eastAsia="Times New Roman" w:hAnsi="Times New Roman"/>
+          <w:b/>
+          <w:bCs/>
+          <w:sz w:val="22"/>
+          <w:szCs w:val="22"/>
+        </w:rPr>
+        <w:t xml:space="preserve">Table 2. </w:t>
+      </w:r>
+      <w:r>
+        <w:rPr>
+          <w:rFonts w:ascii="Times New Roman" w:cs="Times New Roman" w:eastAsia="Times New Roman" w:hAnsi="Times New Roman"/>
+          <w:sz w:val="22"/>
+          <w:szCs w:val="22"/>
+        </w:rPr>
+        <w:t xml:space="preserve">Public human benchmarks by phenomenon</w:t>
+      </w:r>
+    </w:p>
+    <w:tbl>
+      <w:tblPr>
+        <w:tblW w:type="dxa" w:w="9360"/>
+        <w:tblBorders>
+          <w:top w:val="single" w:color="auto" w:sz="4"/>
+          <w:left w:val="single" w:color="auto" w:sz="4"/>
+          <w:bottom w:val="single" w:color="auto" w:sz="4"/>
+          <w:right w:val="single" w:color="auto" w:sz="4"/>
+          <w:insideH w:val="single" w:color="auto" w:sz="4"/>
+          <w:insideV w:val="single" w:color="auto" w:sz="4"/>
+        </w:tblBorders>
+      </w:tblPr>
+      <w:tblGrid>
+        <w:gridCol w:w="1450"/>
+        <w:gridCol w:w="3250"/>
+        <w:gridCol w:w="2900"/>
+        <w:gridCol w:w="1760"/>
+      </w:tblGrid>
+      <w:tr>
+        <w:trPr>
+          <w:tblHeader/>
+        </w:trPr>
+        <w:tc>
+          <w:tcPr>
+            <w:tcW w:type="dxa" w:w="1450"/>
+            <w:tcBorders>
+              <w:top w:val="single" w:color="000000" w:sz="4"/>
+              <w:left w:val="single" w:color="000000" w:sz="4"/>
+              <w:bottom w:val="single" w:color="000000" w:sz="4"/>
+              <w:right w:val="single" w:color="000000" w:sz="4"/>
+            </w:tcBorders>
+            <w:shd w:fill="E7E7E7" w:color="auto" w:val="clear"/>
+            <w:tcMar>
+              <w:top w:type="dxa" w:w="60"/>
+              <w:left w:type="dxa" w:w="90"/>
+              <w:bottom w:type="dxa" w:w="60"/>
+              <w:right w:type="dxa" w:w="90"/>
+            </w:tcMar>
+          </w:tcPr>
+          <w:p>
+            <w:r>
+              <w:rPr>
+                <w:rFonts w:ascii="Times New Roman" w:cs="Times New Roman" w:eastAsia="Times New Roman" w:hAnsi="Times New Roman"/>
+                <w:b/>
+                <w:bCs/>
+                <w:sz w:val="20"/>
+                <w:szCs w:val="20"/>
+              </w:rPr>
+              <w:t xml:space="preserve">Phenomenon</w:t>
+            </w:r>
+          </w:p>
+        </w:tc>
+        <w:tc>
+          <w:tcPr>
+            <w:tcW w:type="dxa" w:w="3250"/>
+            <w:tcBorders>
+              <w:top w:val="single" w:color="000000" w:sz="4"/>
+              <w:left w:val="single" w:color="000000" w:sz="4"/>
+              <w:bottom w:val="single" w:color="000000" w:sz="4"/>
+              <w:right w:val="single" w:color="000000" w:sz="4"/>
+            </w:tcBorders>
+            <w:shd w:fill="E7E7E7" w:color="auto" w:val="clear"/>
+            <w:tcMar>
+              <w:top w:type="dxa" w:w="60"/>
+              <w:left w:type="dxa" w:w="90"/>
+              <w:bottom w:type="dxa" w:w="60"/>
+              <w:right w:type="dxa" w:w="90"/>
+            </w:tcMar>
+          </w:tcPr>
+          <w:p>
+            <w:r>
+              <w:rPr>
+                <w:rFonts w:ascii="Times New Roman" w:cs="Times New Roman" w:eastAsia="Times New Roman" w:hAnsi="Times New Roman"/>
+                <w:b/>
+                <w:bCs/>
+                <w:sz w:val="20"/>
+                <w:szCs w:val="20"/>
+              </w:rPr>
+              <w:t xml:space="preserve">Public human benchmark (classic paradigm)</w:t>
+            </w:r>
+          </w:p>
+        </w:tc>
+        <w:tc>
+          <w:tcPr>
+            <w:tcW w:type="dxa" w:w="2900"/>
+            <w:tcBorders>
+              <w:top w:val="single" w:color="000000" w:sz="4"/>
+              <w:left w:val="single" w:color="000000" w:sz="4"/>
+              <w:bottom w:val="single" w:color="000000" w:sz="4"/>
+              <w:right w:val="single" w:color="000000" w:sz="4"/>
+            </w:tcBorders>
+            <w:shd w:fill="E7E7E7" w:color="auto" w:val="clear"/>
+            <w:tcMar>
+              <w:top w:type="dxa" w:w="60"/>
+              <w:left w:type="dxa" w:w="90"/>
+              <w:bottom w:type="dxa" w:w="60"/>
+              <w:right w:type="dxa" w:w="90"/>
+            </w:tcMar>
+          </w:tcPr>
+          <w:p>
+            <w:r>
+              <w:rPr>
+                <w:rFonts w:ascii="Times New Roman" w:cs="Times New Roman" w:eastAsia="Times New Roman" w:hAnsi="Times New Roman"/>
+                <w:b/>
+                <w:bCs/>
+                <w:sz w:val="20"/>
+                <w:szCs w:val="20"/>
+              </w:rPr>
+              <w:t xml:space="preserve">Public human benchmark (novel paradigm)</w:t>
+            </w:r>
+          </w:p>
+        </w:tc>
+        <w:tc>
+          <w:tcPr>
+            <w:tcW w:type="dxa" w:w="1760"/>
+            <w:tcBorders>
+              <w:top w:val="single" w:color="000000" w:sz="4"/>
+              <w:left w:val="single" w:color="000000" w:sz="4"/>
+              <w:bottom w:val="single" w:color="000000" w:sz="4"/>
+              <w:right w:val="single" w:color="000000" w:sz="4"/>
+            </w:tcBorders>
+            <w:shd w:fill="E7E7E7" w:color="auto" w:val="clear"/>
+            <w:tcMar>
+              <w:top w:type="dxa" w:w="60"/>
+              <w:left w:type="dxa" w:w="90"/>
+              <w:bottom w:type="dxa" w:w="60"/>
+              <w:right w:type="dxa" w:w="90"/>
+            </w:tcMar>
+          </w:tcPr>
+          <w:p>
+            <w:r>
+              <w:rPr>
+                <w:rFonts w:ascii="Times New Roman" w:cs="Times New Roman" w:eastAsia="Times New Roman" w:hAnsi="Times New Roman"/>
+                <w:b/>
+                <w:bCs/>
+                <w:sz w:val="20"/>
+                <w:szCs w:val="20"/>
+              </w:rPr>
+              <w:t xml:space="preserve">Coverage</w:t>
+            </w:r>
+          </w:p>
+        </w:tc>
+      </w:tr>
+      <w:tr>
+        <w:trPr>
+          <w:cantSplit/>
+        </w:trPr>
+        <w:tc>
+          <w:tcPr>
+            <w:tcW w:type="dxa" w:w="1450"/>
+            <w:tcBorders>
+              <w:top w:val="single" w:color="000000" w:sz="4"/>
+              <w:left w:val="single" w:color="000000" w:sz="4"/>
+              <w:bottom w:val="single" w:color="000000" w:sz="4"/>
+              <w:right w:val="single" w:color="000000" w:sz="4"/>
+            </w:tcBorders>
+            <w:tcMar>
+              <w:top w:type="dxa" w:w="60"/>
+              <w:left w:type="dxa" w:w="90"/>
+              <w:bottom w:type="dxa" w:w="60"/>
+              <w:right w:type="dxa" w:w="90"/>
+            </w:tcMar>
+          </w:tcPr>
+          <w:p>
+            <w:r>
+              <w:rPr>
+                <w:rFonts w:ascii="Times New Roman" w:cs="Times New Roman" w:eastAsia="Times New Roman" w:hAnsi="Times New Roman"/>
+                <w:b w:val="false"/>
+                <w:bCs w:val="false"/>
+                <w:sz w:val="20"/>
+                <w:szCs w:val="20"/>
+              </w:rPr>
+              <w:t xml:space="preserve">Loss framing</w:t>
+            </w:r>
+          </w:p>
+        </w:tc>
+        <w:tc>
+          <w:tcPr>
+            <w:tcW w:type="dxa" w:w="3250"/>
+            <w:tcBorders>
+              <w:top w:val="single" w:color="000000" w:sz="4"/>
+              <w:left w:val="single" w:color="000000" w:sz="4"/>
+              <w:bottom w:val="single" w:color="000000" w:sz="4"/>
+              <w:right w:val="single" w:color="000000" w:sz="4"/>
+            </w:tcBorders>
+            <w:tcMar>
+              <w:top w:type="dxa" w:w="60"/>
+              <w:left w:type="dxa" w:w="90"/>
+              <w:bottom w:type="dxa" w:w="60"/>
+              <w:right w:type="dxa" w:w="90"/>
+            </w:tcMar>
+          </w:tcPr>
+          <w:p>
+            <w:r>
+              <w:rPr>
+                <w:rFonts w:ascii="Times New Roman" w:cs="Times New Roman" w:eastAsia="Times New Roman" w:hAnsi="Times New Roman"/>
+                <w:b w:val="false"/>
+                <w:bCs w:val="false"/>
+                <w:sz w:val="20"/>
+                <w:szCs w:val="20"/>
+              </w:rPr>
+              <w:t xml:space="preserve">Twin-2K-500: gain/loss framing problem (waves 2 and 4); Brown et al. (2024) meta-analysis</w:t>
+            </w:r>
+          </w:p>
+        </w:tc>
+        <w:tc>
+          <w:tcPr>
+            <w:tcW w:type="dxa" w:w="2900"/>
+            <w:tcBorders>
+              <w:top w:val="single" w:color="000000" w:sz="4"/>
+              <w:left w:val="single" w:color="000000" w:sz="4"/>
+              <w:bottom w:val="single" w:color="000000" w:sz="4"/>
+              <w:right w:val="single" w:color="000000" w:sz="4"/>
+            </w:tcBorders>
+            <w:tcMar>
+              <w:top w:type="dxa" w:w="60"/>
+              <w:left w:type="dxa" w:w="90"/>
+              <w:bottom w:type="dxa" w:w="60"/>
+              <w:right w:type="dxa" w:w="90"/>
+            </w:tcMar>
+          </w:tcPr>
+          <w:p>
+            <w:r>
+              <w:rPr>
+                <w:rFonts w:ascii="Times New Roman" w:cs="Times New Roman" w:eastAsia="Times New Roman" w:hAnsi="Times New Roman"/>
+                <w:b w:val="false"/>
+                <w:bCs w:val="false"/>
+                <w:sz w:val="20"/>
+                <w:szCs w:val="20"/>
+              </w:rPr>
+              <w:t xml:space="preserve">None identified</w:t>
+            </w:r>
+          </w:p>
+        </w:tc>
+        <w:tc>
+          <w:tcPr>
+            <w:tcW w:type="dxa" w:w="1760"/>
+            <w:tcBorders>
+              <w:top w:val="single" w:color="000000" w:sz="4"/>
+              <w:left w:val="single" w:color="000000" w:sz="4"/>
+              <w:bottom w:val="single" w:color="000000" w:sz="4"/>
+              <w:right w:val="single" w:color="000000" w:sz="4"/>
+            </w:tcBorders>
+            <w:tcMar>
+              <w:top w:type="dxa" w:w="60"/>
+              <w:left w:type="dxa" w:w="90"/>
+              <w:bottom w:type="dxa" w:w="60"/>
+              <w:right w:type="dxa" w:w="90"/>
+            </w:tcMar>
+          </w:tcPr>
+          <w:p>
+            <w:r>
+              <w:rPr>
+                <w:rFonts w:ascii="Times New Roman" w:cs="Times New Roman" w:eastAsia="Times New Roman" w:hAnsi="Times New Roman"/>
+                <w:b w:val="false"/>
+                <w:bCs w:val="false"/>
+                <w:sz w:val="20"/>
+                <w:szCs w:val="20"/>
+              </w:rPr>
+              <w:t xml:space="preserve">Classic only</w:t>
+            </w:r>
+          </w:p>
+        </w:tc>
+      </w:tr>
+      <w:tr>
+        <w:trPr>
+          <w:cantSplit/>
+        </w:trPr>
+        <w:tc>
+          <w:tcPr>
+            <w:tcW w:type="dxa" w:w="1450"/>
+            <w:tcBorders>
+              <w:top w:val="single" w:color="000000" w:sz="4"/>
+              <w:left w:val="single" w:color="000000" w:sz="4"/>
+              <w:bottom w:val="single" w:color="000000" w:sz="4"/>
+              <w:right w:val="single" w:color="000000" w:sz="4"/>
+            </w:tcBorders>
+            <w:tcMar>
+              <w:top w:type="dxa" w:w="60"/>
+              <w:left w:type="dxa" w:w="90"/>
+              <w:bottom w:type="dxa" w:w="60"/>
+              <w:right w:type="dxa" w:w="90"/>
+            </w:tcMar>
+          </w:tcPr>
+          <w:p>
+            <w:r>
+              <w:rPr>
+                <w:rFonts w:ascii="Times New Roman" w:cs="Times New Roman" w:eastAsia="Times New Roman" w:hAnsi="Times New Roman"/>
+                <w:b w:val="false"/>
+                <w:bCs w:val="false"/>
+                <w:sz w:val="20"/>
+                <w:szCs w:val="20"/>
+              </w:rPr>
+              <w:t xml:space="preserve">Defaults</w:t>
+            </w:r>
+          </w:p>
+        </w:tc>
+        <w:tc>
+          <w:tcPr>
+            <w:tcW w:type="dxa" w:w="3250"/>
+            <w:tcBorders>
+              <w:top w:val="single" w:color="000000" w:sz="4"/>
+              <w:left w:val="single" w:color="000000" w:sz="4"/>
+              <w:bottom w:val="single" w:color="000000" w:sz="4"/>
+              <w:right w:val="single" w:color="000000" w:sz="4"/>
+            </w:tcBorders>
+            <w:tcMar>
+              <w:top w:type="dxa" w:w="60"/>
+              <w:left w:type="dxa" w:w="90"/>
+              <w:bottom w:type="dxa" w:w="60"/>
+              <w:right w:type="dxa" w:w="90"/>
+            </w:tcMar>
+          </w:tcPr>
+          <w:p>
+            <w:r>
+              <w:rPr>
+                <w:rFonts w:ascii="Times New Roman" w:cs="Times New Roman" w:eastAsia="Times New Roman" w:hAnsi="Times New Roman"/>
+                <w:b w:val="false"/>
+                <w:bCs w:val="false"/>
+                <w:sz w:val="20"/>
+                <w:szCs w:val="20"/>
+              </w:rPr>
+              <w:t xml:space="preserve">Mega-study: organ-donation paradigm; Jachimowicz et al. (2019)</w:t>
+            </w:r>
+          </w:p>
+        </w:tc>
+        <w:tc>
+          <w:tcPr>
+            <w:tcW w:type="dxa" w:w="2900"/>
+            <w:tcBorders>
+              <w:top w:val="single" w:color="000000" w:sz="4"/>
+              <w:left w:val="single" w:color="000000" w:sz="4"/>
+              <w:bottom w:val="single" w:color="000000" w:sz="4"/>
+              <w:right w:val="single" w:color="000000" w:sz="4"/>
+            </w:tcBorders>
+            <w:tcMar>
+              <w:top w:type="dxa" w:w="60"/>
+              <w:left w:type="dxa" w:w="90"/>
+              <w:bottom w:type="dxa" w:w="60"/>
+              <w:right w:type="dxa" w:w="90"/>
+            </w:tcMar>
+          </w:tcPr>
+          <w:p>
+            <w:r>
+              <w:rPr>
+                <w:rFonts w:ascii="Times New Roman" w:cs="Times New Roman" w:eastAsia="Times New Roman" w:hAnsi="Times New Roman"/>
+                <w:b w:val="false"/>
+                <w:bCs w:val="false"/>
+                <w:sz w:val="20"/>
+                <w:szCs w:val="20"/>
+              </w:rPr>
+              <w:t xml:space="preserve">Mega-study: green-energy paradigm, treated as novel by the authors</w:t>
+            </w:r>
+          </w:p>
+        </w:tc>
+        <w:tc>
+          <w:tcPr>
+            <w:tcW w:type="dxa" w:w="1760"/>
+            <w:tcBorders>
+              <w:top w:val="single" w:color="000000" w:sz="4"/>
+              <w:left w:val="single" w:color="000000" w:sz="4"/>
+              <w:bottom w:val="single" w:color="000000" w:sz="4"/>
+              <w:right w:val="single" w:color="000000" w:sz="4"/>
+            </w:tcBorders>
+            <w:tcMar>
+              <w:top w:type="dxa" w:w="60"/>
+              <w:left w:type="dxa" w:w="90"/>
+              <w:bottom w:type="dxa" w:w="60"/>
+              <w:right w:type="dxa" w:w="90"/>
+            </w:tcMar>
+          </w:tcPr>
+          <w:p>
+            <w:r>
+              <w:rPr>
+                <w:rFonts w:ascii="Times New Roman" w:cs="Times New Roman" w:eastAsia="Times New Roman" w:hAnsi="Times New Roman"/>
+                <w:b w:val="false"/>
+                <w:bCs w:val="false"/>
+                <w:sz w:val="20"/>
+                <w:szCs w:val="20"/>
+              </w:rPr>
+              <w:t xml:space="preserve">Classic and novel</w:t>
+            </w:r>
+          </w:p>
+        </w:tc>
+      </w:tr>
+      <w:tr>
+        <w:trPr>
+          <w:cantSplit/>
+        </w:trPr>
+        <w:tc>
+          <w:tcPr>
+            <w:tcW w:type="dxa" w:w="1450"/>
+            <w:tcBorders>
+              <w:top w:val="single" w:color="000000" w:sz="4"/>
+              <w:left w:val="single" w:color="000000" w:sz="4"/>
+              <w:bottom w:val="single" w:color="000000" w:sz="4"/>
+              <w:right w:val="single" w:color="000000" w:sz="4"/>
+            </w:tcBorders>
+            <w:tcMar>
+              <w:top w:type="dxa" w:w="60"/>
+              <w:left w:type="dxa" w:w="90"/>
+              <w:bottom w:type="dxa" w:w="60"/>
+              <w:right w:type="dxa" w:w="90"/>
+            </w:tcMar>
+          </w:tcPr>
+          <w:p>
+            <w:r>
+              <w:rPr>
+                <w:rFonts w:ascii="Times New Roman" w:cs="Times New Roman" w:eastAsia="Times New Roman" w:hAnsi="Times New Roman"/>
+                <w:b w:val="false"/>
+                <w:bCs w:val="false"/>
+                <w:sz w:val="20"/>
+                <w:szCs w:val="20"/>
+              </w:rPr>
+              <w:t xml:space="preserve">Anchoring</w:t>
+            </w:r>
+          </w:p>
+        </w:tc>
+        <w:tc>
+          <w:tcPr>
+            <w:tcW w:type="dxa" w:w="3250"/>
+            <w:tcBorders>
+              <w:top w:val="single" w:color="000000" w:sz="4"/>
+              <w:left w:val="single" w:color="000000" w:sz="4"/>
+              <w:bottom w:val="single" w:color="000000" w:sz="4"/>
+              <w:right w:val="single" w:color="000000" w:sz="4"/>
+            </w:tcBorders>
+            <w:tcMar>
+              <w:top w:type="dxa" w:w="60"/>
+              <w:left w:type="dxa" w:w="90"/>
+              <w:bottom w:type="dxa" w:w="60"/>
+              <w:right w:type="dxa" w:w="90"/>
+            </w:tcMar>
+          </w:tcPr>
+          <w:p>
+            <w:r>
+              <w:rPr>
+                <w:rFonts w:ascii="Times New Roman" w:cs="Times New Roman" w:eastAsia="Times New Roman" w:hAnsi="Times New Roman"/>
+                <w:b w:val="false"/>
+                <w:bCs w:val="false"/>
+                <w:sz w:val="20"/>
+                <w:szCs w:val="20"/>
+              </w:rPr>
+              <w:t xml:space="preserve">Twin-2K-500: two numerical anchoring items (waves 2 and 4); Many Labs</w:t>
+            </w:r>
+          </w:p>
+        </w:tc>
+        <w:tc>
+          <w:tcPr>
+            <w:tcW w:type="dxa" w:w="2900"/>
+            <w:tcBorders>
+              <w:top w:val="single" w:color="000000" w:sz="4"/>
+              <w:left w:val="single" w:color="000000" w:sz="4"/>
+              <w:bottom w:val="single" w:color="000000" w:sz="4"/>
+              <w:right w:val="single" w:color="000000" w:sz="4"/>
+            </w:tcBorders>
+            <w:tcMar>
+              <w:top w:type="dxa" w:w="60"/>
+              <w:left w:type="dxa" w:w="90"/>
+              <w:bottom w:type="dxa" w:w="60"/>
+              <w:right w:type="dxa" w:w="90"/>
+            </w:tcMar>
+          </w:tcPr>
+          <w:p>
+            <w:r>
+              <w:rPr>
+                <w:rFonts w:ascii="Times New Roman" w:cs="Times New Roman" w:eastAsia="Times New Roman" w:hAnsi="Times New Roman"/>
+                <w:b w:val="false"/>
+                <w:bCs w:val="false"/>
+                <w:sz w:val="20"/>
+                <w:szCs w:val="20"/>
+              </w:rPr>
+              <w:t xml:space="preserve">None identified</w:t>
+            </w:r>
+          </w:p>
+        </w:tc>
+        <w:tc>
+          <w:tcPr>
+            <w:tcW w:type="dxa" w:w="1760"/>
+            <w:tcBorders>
+              <w:top w:val="single" w:color="000000" w:sz="4"/>
+              <w:left w:val="single" w:color="000000" w:sz="4"/>
+              <w:bottom w:val="single" w:color="000000" w:sz="4"/>
+              <w:right w:val="single" w:color="000000" w:sz="4"/>
+            </w:tcBorders>
+            <w:tcMar>
+              <w:top w:type="dxa" w:w="60"/>
+              <w:left w:type="dxa" w:w="90"/>
+              <w:bottom w:type="dxa" w:w="60"/>
+              <w:right w:type="dxa" w:w="90"/>
+            </w:tcMar>
+          </w:tcPr>
+          <w:p>
+            <w:r>
+              <w:rPr>
+                <w:rFonts w:ascii="Times New Roman" w:cs="Times New Roman" w:eastAsia="Times New Roman" w:hAnsi="Times New Roman"/>
+                <w:b w:val="false"/>
+                <w:bCs w:val="false"/>
+                <w:sz w:val="20"/>
+                <w:szCs w:val="20"/>
+              </w:rPr>
+              <w:t xml:space="preserve">Classic only; few items</w:t>
+            </w:r>
+          </w:p>
+        </w:tc>
+      </w:tr>
+      <w:tr>
+        <w:trPr>
+          <w:cantSplit/>
+        </w:trPr>
+        <w:tc>
+          <w:tcPr>
+            <w:tcW w:type="dxa" w:w="1450"/>
+            <w:tcBorders>
+              <w:top w:val="single" w:color="000000" w:sz="4"/>
+              <w:left w:val="single" w:color="000000" w:sz="4"/>
+              <w:bottom w:val="single" w:color="000000" w:sz="4"/>
+              <w:right w:val="single" w:color="000000" w:sz="4"/>
+            </w:tcBorders>
+            <w:tcMar>
+              <w:top w:type="dxa" w:w="60"/>
+              <w:left w:type="dxa" w:w="90"/>
+              <w:bottom w:type="dxa" w:w="60"/>
+              <w:right w:type="dxa" w:w="90"/>
+            </w:tcMar>
+          </w:tcPr>
+          <w:p>
+            <w:r>
+              <w:rPr>
+                <w:rFonts w:ascii="Times New Roman" w:cs="Times New Roman" w:eastAsia="Times New Roman" w:hAnsi="Times New Roman"/>
+                <w:b w:val="false"/>
+                <w:bCs w:val="false"/>
+                <w:sz w:val="20"/>
+                <w:szCs w:val="20"/>
+              </w:rPr>
+              <w:t xml:space="preserve">Decoys</w:t>
+            </w:r>
+          </w:p>
+        </w:tc>
+        <w:tc>
+          <w:tcPr>
+            <w:tcW w:type="dxa" w:w="3250"/>
+            <w:tcBorders>
+              <w:top w:val="single" w:color="000000" w:sz="4"/>
+              <w:left w:val="single" w:color="000000" w:sz="4"/>
+              <w:bottom w:val="single" w:color="000000" w:sz="4"/>
+              <w:right w:val="single" w:color="000000" w:sz="4"/>
+            </w:tcBorders>
+            <w:tcMar>
+              <w:top w:type="dxa" w:w="60"/>
+              <w:left w:type="dxa" w:w="90"/>
+              <w:bottom w:type="dxa" w:w="60"/>
+              <w:right w:type="dxa" w:w="90"/>
+            </w:tcMar>
+          </w:tcPr>
+          <w:p>
+            <w:r>
+              <w:rPr>
+                <w:rFonts w:ascii="Times New Roman" w:cs="Times New Roman" w:eastAsia="Times New Roman" w:hAnsi="Times New Roman"/>
+                <w:b w:val="false"/>
+                <w:bCs w:val="false"/>
+                <w:sz w:val="20"/>
+                <w:szCs w:val="20"/>
+              </w:rPr>
+              <w:t xml:space="preserve">Mega-study: attraction and compromise effects</w:t>
+            </w:r>
+          </w:p>
+        </w:tc>
+        <w:tc>
+          <w:tcPr>
+            <w:tcW w:type="dxa" w:w="2900"/>
+            <w:tcBorders>
+              <w:top w:val="single" w:color="000000" w:sz="4"/>
+              <w:left w:val="single" w:color="000000" w:sz="4"/>
+              <w:bottom w:val="single" w:color="000000" w:sz="4"/>
+              <w:right w:val="single" w:color="000000" w:sz="4"/>
+            </w:tcBorders>
+            <w:tcMar>
+              <w:top w:type="dxa" w:w="60"/>
+              <w:left w:type="dxa" w:w="90"/>
+              <w:bottom w:type="dxa" w:w="60"/>
+              <w:right w:type="dxa" w:w="90"/>
+            </w:tcMar>
+          </w:tcPr>
+          <w:p>
+            <w:r>
+              <w:rPr>
+                <w:rFonts w:ascii="Times New Roman" w:cs="Times New Roman" w:eastAsia="Times New Roman" w:hAnsi="Times New Roman"/>
+                <w:b w:val="false"/>
+                <w:bCs w:val="false"/>
+                <w:sz w:val="20"/>
+                <w:szCs w:val="20"/>
+              </w:rPr>
+              <w:t xml:space="preserve">Mega-study: newly developed stimuli that twins could not have seen</w:t>
+            </w:r>
+          </w:p>
+        </w:tc>
+        <w:tc>
+          <w:tcPr>
+            <w:tcW w:type="dxa" w:w="1760"/>
+            <w:tcBorders>
+              <w:top w:val="single" w:color="000000" w:sz="4"/>
+              <w:left w:val="single" w:color="000000" w:sz="4"/>
+              <w:bottom w:val="single" w:color="000000" w:sz="4"/>
+              <w:right w:val="single" w:color="000000" w:sz="4"/>
+            </w:tcBorders>
+            <w:tcMar>
+              <w:top w:type="dxa" w:w="60"/>
+              <w:left w:type="dxa" w:w="90"/>
+              <w:bottom w:type="dxa" w:w="60"/>
+              <w:right w:type="dxa" w:w="90"/>
+            </w:tcMar>
+          </w:tcPr>
+          <w:p>
+            <w:r>
+              <w:rPr>
+                <w:rFonts w:ascii="Times New Roman" w:cs="Times New Roman" w:eastAsia="Times New Roman" w:hAnsi="Times New Roman"/>
+                <w:b w:val="false"/>
+                <w:bCs w:val="false"/>
+                <w:sz w:val="20"/>
+                <w:szCs w:val="20"/>
+              </w:rPr>
+              <w:t xml:space="preserve">Novel; classic stimuli to be added</w:t>
+            </w:r>
+          </w:p>
+        </w:tc>
+      </w:tr>
+      <w:tr>
+        <w:trPr>
+          <w:cantSplit/>
+        </w:trPr>
+        <w:tc>
+          <w:tcPr>
+            <w:tcW w:type="dxa" w:w="1450"/>
+            <w:tcBorders>
+              <w:top w:val="single" w:color="000000" w:sz="4"/>
+              <w:left w:val="single" w:color="000000" w:sz="4"/>
+              <w:bottom w:val="single" w:color="000000" w:sz="4"/>
+              <w:right w:val="single" w:color="000000" w:sz="4"/>
+            </w:tcBorders>
+            <w:tcMar>
+              <w:top w:type="dxa" w:w="60"/>
+              <w:left w:type="dxa" w:w="90"/>
+              <w:bottom w:type="dxa" w:w="60"/>
+              <w:right w:type="dxa" w:w="90"/>
+            </w:tcMar>
+          </w:tcPr>
+          <w:p>
+            <w:r>
+              <w:rPr>
+                <w:rFonts w:ascii="Times New Roman" w:cs="Times New Roman" w:eastAsia="Times New Roman" w:hAnsi="Times New Roman"/>
+                <w:b w:val="false"/>
+                <w:bCs w:val="false"/>
+                <w:sz w:val="20"/>
+                <w:szCs w:val="20"/>
+              </w:rPr>
+              <w:t xml:space="preserve">Choice overload</w:t>
+            </w:r>
+          </w:p>
+        </w:tc>
+        <w:tc>
+          <w:tcPr>
+            <w:tcW w:type="dxa" w:w="3250"/>
+            <w:tcBorders>
+              <w:top w:val="single" w:color="000000" w:sz="4"/>
+              <w:left w:val="single" w:color="000000" w:sz="4"/>
+              <w:bottom w:val="single" w:color="000000" w:sz="4"/>
+              <w:right w:val="single" w:color="000000" w:sz="4"/>
+            </w:tcBorders>
+            <w:tcMar>
+              <w:top w:type="dxa" w:w="60"/>
+              <w:left w:type="dxa" w:w="90"/>
+              <w:bottom w:type="dxa" w:w="60"/>
+              <w:right w:type="dxa" w:w="90"/>
+            </w:tcMar>
+          </w:tcPr>
+          <w:p>
+            <w:r>
+              <w:rPr>
+                <w:rFonts w:ascii="Times New Roman" w:cs="Times New Roman" w:eastAsia="Times New Roman" w:hAnsi="Times New Roman"/>
+                <w:b w:val="false"/>
+                <w:bCs w:val="false"/>
+                <w:sz w:val="20"/>
+                <w:szCs w:val="20"/>
+              </w:rPr>
+              <w:t xml:space="preserve">None identified; Scheibehenne et al. (2010) meta-analysis</w:t>
+            </w:r>
+          </w:p>
+        </w:tc>
+        <w:tc>
+          <w:tcPr>
+            <w:tcW w:type="dxa" w:w="2900"/>
+            <w:tcBorders>
+              <w:top w:val="single" w:color="000000" w:sz="4"/>
+              <w:left w:val="single" w:color="000000" w:sz="4"/>
+              <w:bottom w:val="single" w:color="000000" w:sz="4"/>
+              <w:right w:val="single" w:color="000000" w:sz="4"/>
+            </w:tcBorders>
+            <w:tcMar>
+              <w:top w:type="dxa" w:w="60"/>
+              <w:left w:type="dxa" w:w="90"/>
+              <w:bottom w:type="dxa" w:w="60"/>
+              <w:right w:type="dxa" w:w="90"/>
+            </w:tcMar>
+          </w:tcPr>
+          <w:p>
+            <w:r>
+              <w:rPr>
+                <w:rFonts w:ascii="Times New Roman" w:cs="Times New Roman" w:eastAsia="Times New Roman" w:hAnsi="Times New Roman"/>
+                <w:b w:val="false"/>
+                <w:bCs w:val="false"/>
+                <w:sz w:val="20"/>
+                <w:szCs w:val="20"/>
+              </w:rPr>
+              <w:t xml:space="preserve">None identified</w:t>
+            </w:r>
+          </w:p>
+        </w:tc>
+        <w:tc>
+          <w:tcPr>
+            <w:tcW w:type="dxa" w:w="1760"/>
+            <w:tcBorders>
+              <w:top w:val="single" w:color="000000" w:sz="4"/>
+              <w:left w:val="single" w:color="000000" w:sz="4"/>
+              <w:bottom w:val="single" w:color="000000" w:sz="4"/>
+              <w:right w:val="single" w:color="000000" w:sz="4"/>
+            </w:tcBorders>
+            <w:tcMar>
+              <w:top w:type="dxa" w:w="60"/>
+              <w:left w:type="dxa" w:w="90"/>
+              <w:bottom w:type="dxa" w:w="60"/>
+              <w:right w:type="dxa" w:w="90"/>
+            </w:tcMar>
+          </w:tcPr>
+          <w:p>
+            <w:r>
+              <w:rPr>
+                <w:rFonts w:ascii="Times New Roman" w:cs="Times New Roman" w:eastAsia="Times New Roman" w:hAnsi="Times New Roman"/>
+                <w:b w:val="false"/>
+                <w:bCs w:val="false"/>
+                <w:sz w:val="20"/>
+                <w:szCs w:val="20"/>
+              </w:rPr>
+              <w:t xml:space="preserve">Meta-analytic only</w:t>
+            </w:r>
+          </w:p>
+        </w:tc>
+      </w:tr>
+      <w:tr>
+        <w:trPr>
+          <w:cantSplit/>
+        </w:trPr>
+        <w:tc>
+          <w:tcPr>
+            <w:tcW w:type="dxa" w:w="1450"/>
+            <w:tcBorders>
+              <w:top w:val="single" w:color="000000" w:sz="4"/>
+              <w:left w:val="single" w:color="000000" w:sz="4"/>
+              <w:bottom w:val="single" w:color="000000" w:sz="4"/>
+              <w:right w:val="single" w:color="000000" w:sz="4"/>
+            </w:tcBorders>
+            <w:tcMar>
+              <w:top w:type="dxa" w:w="60"/>
+              <w:left w:type="dxa" w:w="90"/>
+              <w:bottom w:type="dxa" w:w="60"/>
+              <w:right w:type="dxa" w:w="90"/>
+            </w:tcMar>
+          </w:tcPr>
+          <w:p>
+            <w:r>
+              <w:rPr>
+                <w:rFonts w:ascii="Times New Roman" w:cs="Times New Roman" w:eastAsia="Times New Roman" w:hAnsi="Times New Roman"/>
+                <w:b w:val="false"/>
+                <w:bCs w:val="false"/>
+                <w:sz w:val="20"/>
+                <w:szCs w:val="20"/>
+              </w:rPr>
+              <w:t xml:space="preserve">Fairness</w:t>
+            </w:r>
+          </w:p>
+        </w:tc>
+        <w:tc>
+          <w:tcPr>
+            <w:tcW w:type="dxa" w:w="3250"/>
+            <w:tcBorders>
+              <w:top w:val="single" w:color="000000" w:sz="4"/>
+              <w:left w:val="single" w:color="000000" w:sz="4"/>
+              <w:bottom w:val="single" w:color="000000" w:sz="4"/>
+              <w:right w:val="single" w:color="000000" w:sz="4"/>
+            </w:tcBorders>
+            <w:tcMar>
+              <w:top w:type="dxa" w:w="60"/>
+              <w:left w:type="dxa" w:w="90"/>
+              <w:bottom w:type="dxa" w:w="60"/>
+              <w:right w:type="dxa" w:w="90"/>
+            </w:tcMar>
+          </w:tcPr>
+          <w:p>
+            <w:r>
+              <w:rPr>
+                <w:rFonts w:ascii="Times New Roman" w:cs="Times New Roman" w:eastAsia="Times New Roman" w:hAnsi="Times New Roman"/>
+                <w:b w:val="false"/>
+                <w:bCs w:val="false"/>
+                <w:sz w:val="20"/>
+                <w:szCs w:val="20"/>
+              </w:rPr>
+              <w:t xml:space="preserve">Twin-2K-500: ultimatum game, sender and receiver, with human retest</w:t>
+            </w:r>
+          </w:p>
+        </w:tc>
+        <w:tc>
+          <w:tcPr>
+            <w:tcW w:type="dxa" w:w="2900"/>
+            <w:tcBorders>
+              <w:top w:val="single" w:color="000000" w:sz="4"/>
+              <w:left w:val="single" w:color="000000" w:sz="4"/>
+              <w:bottom w:val="single" w:color="000000" w:sz="4"/>
+              <w:right w:val="single" w:color="000000" w:sz="4"/>
+            </w:tcBorders>
+            <w:tcMar>
+              <w:top w:type="dxa" w:w="60"/>
+              <w:left w:type="dxa" w:w="90"/>
+              <w:bottom w:type="dxa" w:w="60"/>
+              <w:right w:type="dxa" w:w="90"/>
+            </w:tcMar>
+          </w:tcPr>
+          <w:p>
+            <w:r>
+              <w:rPr>
+                <w:rFonts w:ascii="Times New Roman" w:cs="Times New Roman" w:eastAsia="Times New Roman" w:hAnsi="Times New Roman"/>
+                <w:b w:val="false"/>
+                <w:bCs w:val="false"/>
+                <w:sz w:val="20"/>
+                <w:szCs w:val="20"/>
+              </w:rPr>
+              <w:t xml:space="preserve">Mega-study: targeting-fairness study (357 humans)</w:t>
+            </w:r>
+          </w:p>
+        </w:tc>
+        <w:tc>
+          <w:tcPr>
+            <w:tcW w:type="dxa" w:w="1760"/>
+            <w:tcBorders>
+              <w:top w:val="single" w:color="000000" w:sz="4"/>
+              <w:left w:val="single" w:color="000000" w:sz="4"/>
+              <w:bottom w:val="single" w:color="000000" w:sz="4"/>
+              <w:right w:val="single" w:color="000000" w:sz="4"/>
+            </w:tcBorders>
+            <w:tcMar>
+              <w:top w:type="dxa" w:w="60"/>
+              <w:left w:type="dxa" w:w="90"/>
+              <w:bottom w:type="dxa" w:w="60"/>
+              <w:right w:type="dxa" w:w="90"/>
+            </w:tcMar>
+          </w:tcPr>
+          <w:p>
+            <w:r>
+              <w:rPr>
+                <w:rFonts w:ascii="Times New Roman" w:cs="Times New Roman" w:eastAsia="Times New Roman" w:hAnsi="Times New Roman"/>
+                <w:b w:val="false"/>
+                <w:bCs w:val="false"/>
+                <w:sz w:val="20"/>
+                <w:szCs w:val="20"/>
+              </w:rPr>
+              <w:t xml:space="preserve">Classic and novel</w:t>
+            </w:r>
+          </w:p>
+        </w:tc>
+      </w:tr>
+    </w:tbl>
+    <w:p>
+      <w:pPr>
+        <w:spacing w:after="200"/>
+      </w:pPr>
+    </w:p>
+    <w:p>
+      <w:pPr>
+        <w:spacing w:line="480"/>
+        <w:ind w:firstLine="720"/>
+      </w:pPr>
+      <w:r>
+        <w:rPr>
+          <w:rFonts w:ascii="Times New Roman" w:cs="Times New Roman" w:eastAsia="Times New Roman" w:hAnsi="Times New Roman"/>
+          <w:sz w:val="24"/>
+          <w:szCs w:val="24"/>
+        </w:rPr>
+        <w:t xml:space="preserve">Coverage is uneven, as Table 2 shows. Choice overload has no item-level human benchmark in either dataset, so for that phenomenon we compare only with meta-analytic estimates (Scheibehenne et al. 2010). For loss framing and anchoring, public data contain the classic paradigms but no matched novel paradigms, so the contamination test (H2) for those phenomena relies on published tests of context variation and is reported as secondary. The contamination test is primary for defaults, decoys, and fairness, where a matched or newly built paradigm has human data.</w:t>
       </w:r>
     </w:p>
     <w:p>
@@ -1640,7 +2553,7 @@
                 <w:sz w:val="20"/>
                 <w:szCs w:val="20"/>
               </w:rPr>
-              <w:t xml:space="preserve">Sign concordance and twin/human effect-size ratio, classic items</w:t>
+              <w:t xml:space="preserve">Sign concordance; twin/human effect-size ratio among sign-correct cells, classic items</w:t>
             </w:r>
           </w:p>
         </w:tc>
@@ -1669,7 +2582,7 @@
                 <w:sz w:val="20"/>
                 <w:szCs w:val="20"/>
               </w:rPr>
-              <w:t xml:space="preserve">Concordance ≥ 0.80 with exact 95% CI lower bound above 0.50; ratio &gt; 1</w:t>
+              <w:t xml:space="preserve">(a) Concordance ≥ 0.80 with exact 95% CI lower bound above 0.50; (b) ratio &gt; 1</w:t>
             </w:r>
           </w:p>
         </w:tc>
@@ -1698,7 +2611,7 @@
                 <w:sz w:val="20"/>
                 <w:szCs w:val="20"/>
               </w:rPr>
-              <w:t xml:space="preserve">Both conditions hold; ratio CI excludes 1</w:t>
+              <w:t xml:space="preserve">(a) and (b) hold; ratio CI excludes 1</w:t>
             </w:r>
           </w:p>
         </w:tc>
@@ -2182,7 +3095,7 @@
                 <w:sz w:val="20"/>
                 <w:szCs w:val="20"/>
               </w:rPr>
-              <w:t xml:space="preserve">Positive ρ and coverage below nominal, with overestimation</w:t>
+              <w:t xml:space="preserve">Positive ρ and coverage below nominal</w:t>
             </w:r>
           </w:p>
         </w:tc>
@@ -2456,7 +3369,7 @@
           <w:sz w:val="24"/>
           <w:szCs w:val="24"/>
         </w:rPr>
-        <w:t xml:space="preserve">Several limitations bound the inferences. First, the platform items are matched to meta-analytic categories but not to the specific populations, stakes, and attention conditions of real platforms, so tests against meta-analytic intervals assess the plausibility of effect sizes, not their predictive accuracy for a given site. Second, human benchmarks for isomorphic items are inferred from published context-variation studies rather than observed on the same items. The contamination test therefore rests on the assumption that human attenuation under cover-story change is adequately captured by that literature, and the post-cutoff stimuli, which have matched human data, provide a check on this assumption. Third, contamination control is necessarily incomplete, since training corpora are undisclosed and isomorphic items may still resemble training text. Fourth, models change rapidly, so results describe specific model versions, and we provide the design and code precisely so that tests can be repeated. Fifth, the human literature itself has known replicability problems, which we address through benchmark uncertainty and the strong/weak replication split. Finally, evidence of functional similarity between LLMs and human cognition does not establish common mechanisms.</w:t>
+        <w:t xml:space="preserve">Several limitations bound the inferences. First, the platform items are matched to meta-analytic categories but not to the specific populations, stakes, and attention conditions of real platforms, so tests against meta-analytic intervals assess the plausibility of effect sizes, not their predictive accuracy for a given site. Second, public human data for novel paradigms exist only for some phenomena (Table 2). For loss framing and anchoring the contamination test rests on the assumption that human attenuation under cover-story change is captured by the published context-variation literature, and for choice overload no item-level human benchmark exists. We report these results as secondary. In addition, both item-level datasets draw on US online panels, so conclusions about fidelity are conditional on that population. Third, contamination control is necessarily incomplete, since training corpora are undisclosed and isomorphic items may still resemble training text. Fourth, models change rapidly, so results describe specific model versions, and we provide the design and code precisely so that tests can be repeated. Fifth, the human literature itself has known replicability problems, which we address through benchmark uncertainty and the strong/weak replication split. Finally, evidence of functional similarity between LLMs and human cognition does not establish common mechanisms.</w:t>
       </w:r>
     </w:p>
     <w:p>
@@ -2813,6 +3726,34 @@
           <w:sz w:val="24"/>
           <w:szCs w:val="24"/>
         </w:rPr>
+        <w:t xml:space="preserve">Peng T, Gui G, Brucks M, et al. (2026) Digital twins are funhouse mirrors: Five systematic distortions. Preprint, submitted September 19, arXiv:2509.19088.</w:t>
+      </w:r>
+    </w:p>
+    <w:p>
+      <w:pPr>
+        <w:spacing w:line="480"/>
+        <w:ind w:left="720" w:hanging="720"/>
+      </w:pPr>
+      <w:r>
+        <w:rPr>
+          <w:rFonts w:ascii="Times New Roman" w:cs="Times New Roman" w:eastAsia="Times New Roman" w:hAnsi="Times New Roman"/>
+          <w:sz w:val="24"/>
+          <w:szCs w:val="24"/>
+        </w:rPr>
+        <w:t xml:space="preserve">Scheibehenne B, Greifeneder R, Todd PM (2010) Can there ever be too many options? A meta-analytic review of choice overload. J. Consumer Res. 37(3):409–425.</w:t>
+      </w:r>
+    </w:p>
+    <w:p>
+      <w:pPr>
+        <w:spacing w:line="480"/>
+        <w:ind w:left="720" w:hanging="720"/>
+      </w:pPr>
+      <w:r>
+        <w:rPr>
+          <w:rFonts w:ascii="Times New Roman" w:cs="Times New Roman" w:eastAsia="Times New Roman" w:hAnsi="Times New Roman"/>
+          <w:sz w:val="24"/>
+          <w:szCs w:val="24"/>
+        </w:rPr>
         <w:t xml:space="preserve">Schneider C, Weinmann M, vom Brocke J (2018) Digital nudging: Guiding online user choices through interface design. Comm. ACM 61(7):67–73.</w:t>
       </w:r>
     </w:p>
@@ -2856,6 +3797,20 @@
           <w:szCs w:val="24"/>
         </w:rPr>
         <w:t xml:space="preserve">Tversky A, Kahneman D (1974) Judgment under uncertainty: Heuristics and biases. Science 185(4157):1124–1131.</w:t>
+      </w:r>
+    </w:p>
+    <w:p>
+      <w:pPr>
+        <w:spacing w:line="480"/>
+        <w:ind w:left="720" w:hanging="720"/>
+      </w:pPr>
+      <w:r>
+        <w:rPr>
+          <w:rFonts w:ascii="Times New Roman" w:cs="Times New Roman" w:eastAsia="Times New Roman" w:hAnsi="Times New Roman"/>
+          <w:sz w:val="24"/>
+          <w:szCs w:val="24"/>
+        </w:rPr>
+        <w:t xml:space="preserve">Wang S, Hunt K, Tang S, Joseph K (2026) When can LLM digital twins reduce human measurement? From behavioral fidelity to statistical substitutability. Preprint, submitted September 7, arXiv:2609.07987.</w:t>
       </w:r>
     </w:p>
     <w:p>

</xml_diff>

<commit_message>
Add computed public human benchmarks to Table 2 and deposit benchmark script
Co-Authored-By: Claude Sonnet 5.5 <noreply@anthropic.com>
Claude-Session: https://claude.ai/code/session_01UvKcabfwJpaPKKhavR8Tdw
</commit_message>
<xml_diff>
--- a/ISR_Digital_Twins_Behavioral_Econ_Paper_v3.docx
+++ b/ISR_Digital_Twins_Behavioral_Econ_Paper_v3.docx
@@ -832,7 +832,7 @@
           <w:sz w:val="24"/>
           <w:szCs w:val="24"/>
         </w:rPr>
-        <w:t xml:space="preserve"> if recovery partly reflects memorization of surface form, it should not transfer fully to rewritten stimuli (Section 2.4). Peng et al. (2026) report consistent preliminary evidence for defaults, which we test across all six phenomena.</w:t>
+        <w:t xml:space="preserve"> if recovery partly reflects memorization of surface form, it should not transfer fully to rewritten stimuli (Section 2.4). Peng et al. (2026) report consistent preliminary evidence for defaults, and the public data show why classic paradigms are informative: the human organ-donation default effect is near zero in this sample (d ≈ 0.10), whereas twins show a strong effect, a pattern that memorization of the original finding would produce. We test this across all six phenomena.</w:t>
       </w:r>
     </w:p>
     <w:p>
@@ -1315,10 +1315,10 @@
         </w:tblBorders>
       </w:tblPr>
       <w:tblGrid>
-        <w:gridCol w:w="1450"/>
+        <w:gridCol w:w="1250"/>
+        <w:gridCol w:w="3300"/>
         <w:gridCol w:w="3250"/>
-        <w:gridCol w:w="2900"/>
-        <w:gridCol w:w="1760"/>
+        <w:gridCol w:w="1560"/>
       </w:tblGrid>
       <w:tr>
         <w:trPr>
@@ -1326,7 +1326,7 @@
         </w:trPr>
         <w:tc>
           <w:tcPr>
-            <w:tcW w:type="dxa" w:w="1450"/>
+            <w:tcW w:type="dxa" w:w="1250"/>
             <w:tcBorders>
               <w:top w:val="single" w:color="000000" w:sz="4"/>
               <w:left w:val="single" w:color="000000" w:sz="4"/>
@@ -1350,13 +1350,13 @@
                 <w:sz w:val="20"/>
                 <w:szCs w:val="20"/>
               </w:rPr>
-              <w:t xml:space="preserve">Phenomenon</w:t>
-            </w:r>
-          </w:p>
-        </w:tc>
-        <w:tc>
-          <w:tcPr>
-            <w:tcW w:type="dxa" w:w="3250"/>
+              <w:t xml:space="preserve">Effect</w:t>
+            </w:r>
+          </w:p>
+        </w:tc>
+        <w:tc>
+          <w:tcPr>
+            <w:tcW w:type="dxa" w:w="3300"/>
             <w:tcBorders>
               <w:top w:val="single" w:color="000000" w:sz="4"/>
               <w:left w:val="single" w:color="000000" w:sz="4"/>
@@ -1386,7 +1386,7 @@
         </w:tc>
         <w:tc>
           <w:tcPr>
-            <w:tcW w:type="dxa" w:w="2900"/>
+            <w:tcW w:type="dxa" w:w="3250"/>
             <w:tcBorders>
               <w:top w:val="single" w:color="000000" w:sz="4"/>
               <w:left w:val="single" w:color="000000" w:sz="4"/>
@@ -1416,7 +1416,7 @@
         </w:tc>
         <w:tc>
           <w:tcPr>
-            <w:tcW w:type="dxa" w:w="1760"/>
+            <w:tcW w:type="dxa" w:w="1560"/>
             <w:tcBorders>
               <w:top w:val="single" w:color="000000" w:sz="4"/>
               <w:left w:val="single" w:color="000000" w:sz="4"/>
@@ -1451,7 +1451,7 @@
         </w:trPr>
         <w:tc>
           <w:tcPr>
-            <w:tcW w:type="dxa" w:w="1450"/>
+            <w:tcW w:type="dxa" w:w="1250"/>
             <w:tcBorders>
               <w:top w:val="single" w:color="000000" w:sz="4"/>
               <w:left w:val="single" w:color="000000" w:sz="4"/>
@@ -1480,6 +1480,35 @@
         </w:tc>
         <w:tc>
           <w:tcPr>
+            <w:tcW w:type="dxa" w:w="3300"/>
+            <w:tcBorders>
+              <w:top w:val="single" w:color="000000" w:sz="4"/>
+              <w:left w:val="single" w:color="000000" w:sz="4"/>
+              <w:bottom w:val="single" w:color="000000" w:sz="4"/>
+              <w:right w:val="single" w:color="000000" w:sz="4"/>
+            </w:tcBorders>
+            <w:tcMar>
+              <w:top w:type="dxa" w:w="60"/>
+              <w:left w:type="dxa" w:w="90"/>
+              <w:bottom w:type="dxa" w:w="60"/>
+              <w:right w:type="dxa" w:w="90"/>
+            </w:tcMar>
+          </w:tcPr>
+          <w:p>
+            <w:r>
+              <w:rPr>
+                <w:rFonts w:ascii="Times New Roman" w:cs="Times New Roman" w:eastAsia="Times New Roman" w:hAnsi="Times New Roman"/>
+                <w:b w:val="false"/>
+                <w:bCs w:val="false"/>
+                <w:sz w:val="20"/>
+                <w:szCs w:val="20"/>
+              </w:rPr>
+              <w:t xml:space="preserve">Twin-2K-500: gain/loss framing problem (waves 2 and 4); Brown et al. (2024) meta-analysis</w:t>
+            </w:r>
+          </w:p>
+        </w:tc>
+        <w:tc>
+          <w:tcPr>
             <w:tcW w:type="dxa" w:w="3250"/>
             <w:tcBorders>
               <w:top w:val="single" w:color="000000" w:sz="4"/>
@@ -1503,42 +1532,13 @@
                 <w:sz w:val="20"/>
                 <w:szCs w:val="20"/>
               </w:rPr>
-              <w:t xml:space="preserve">Twin-2K-500: gain/loss framing problem (waves 2 and 4); Brown et al. (2024) meta-analysis</w:t>
-            </w:r>
-          </w:p>
-        </w:tc>
-        <w:tc>
-          <w:tcPr>
-            <w:tcW w:type="dxa" w:w="2900"/>
-            <w:tcBorders>
-              <w:top w:val="single" w:color="000000" w:sz="4"/>
-              <w:left w:val="single" w:color="000000" w:sz="4"/>
-              <w:bottom w:val="single" w:color="000000" w:sz="4"/>
-              <w:right w:val="single" w:color="000000" w:sz="4"/>
-            </w:tcBorders>
-            <w:tcMar>
-              <w:top w:type="dxa" w:w="60"/>
-              <w:left w:type="dxa" w:w="90"/>
-              <w:bottom w:type="dxa" w:w="60"/>
-              <w:right w:type="dxa" w:w="90"/>
-            </w:tcMar>
-          </w:tcPr>
-          <w:p>
-            <w:r>
-              <w:rPr>
-                <w:rFonts w:ascii="Times New Roman" w:cs="Times New Roman" w:eastAsia="Times New Roman" w:hAnsi="Times New Roman"/>
-                <w:b w:val="false"/>
-                <w:bCs w:val="false"/>
-                <w:sz w:val="20"/>
-                <w:szCs w:val="20"/>
-              </w:rPr>
               <w:t xml:space="preserve">None identified</w:t>
             </w:r>
           </w:p>
         </w:tc>
         <w:tc>
           <w:tcPr>
-            <w:tcW w:type="dxa" w:w="1760"/>
+            <w:tcW w:type="dxa" w:w="1560"/>
             <w:tcBorders>
               <w:top w:val="single" w:color="000000" w:sz="4"/>
               <w:left w:val="single" w:color="000000" w:sz="4"/>
@@ -1572,7 +1572,7 @@
         </w:trPr>
         <w:tc>
           <w:tcPr>
-            <w:tcW w:type="dxa" w:w="1450"/>
+            <w:tcW w:type="dxa" w:w="1250"/>
             <w:tcBorders>
               <w:top w:val="single" w:color="000000" w:sz="4"/>
               <w:left w:val="single" w:color="000000" w:sz="4"/>
@@ -1601,6 +1601,35 @@
         </w:tc>
         <w:tc>
           <w:tcPr>
+            <w:tcW w:type="dxa" w:w="3300"/>
+            <w:tcBorders>
+              <w:top w:val="single" w:color="000000" w:sz="4"/>
+              <w:left w:val="single" w:color="000000" w:sz="4"/>
+              <w:bottom w:val="single" w:color="000000" w:sz="4"/>
+              <w:right w:val="single" w:color="000000" w:sz="4"/>
+            </w:tcBorders>
+            <w:tcMar>
+              <w:top w:type="dxa" w:w="60"/>
+              <w:left w:type="dxa" w:w="90"/>
+              <w:bottom w:type="dxa" w:w="60"/>
+              <w:right w:type="dxa" w:w="90"/>
+            </w:tcMar>
+          </w:tcPr>
+          <w:p>
+            <w:r>
+              <w:rPr>
+                <w:rFonts w:ascii="Times New Roman" w:cs="Times New Roman" w:eastAsia="Times New Roman" w:hAnsi="Times New Roman"/>
+                <w:b w:val="false"/>
+                <w:bCs w:val="false"/>
+                <w:sz w:val="20"/>
+                <w:szCs w:val="20"/>
+              </w:rPr>
+              <w:t xml:space="preserve">Mega-study organ donation (n = 600): donors 60.9% opt-out vs. 56.5% opt-in, difference 4.4 pp, 95% CI −3.5 to 12.3, d ≈ 0.10; Jachimowicz et al. (2019)</w:t>
+            </w:r>
+          </w:p>
+        </w:tc>
+        <w:tc>
+          <w:tcPr>
             <w:tcW w:type="dxa" w:w="3250"/>
             <w:tcBorders>
               <w:top w:val="single" w:color="000000" w:sz="4"/>
@@ -1624,42 +1653,13 @@
                 <w:sz w:val="20"/>
                 <w:szCs w:val="20"/>
               </w:rPr>
-              <w:t xml:space="preserve">Mega-study: organ-donation paradigm; Jachimowicz et al. (2019)</w:t>
-            </w:r>
-          </w:p>
-        </w:tc>
-        <w:tc>
-          <w:tcPr>
-            <w:tcW w:type="dxa" w:w="2900"/>
-            <w:tcBorders>
-              <w:top w:val="single" w:color="000000" w:sz="4"/>
-              <w:left w:val="single" w:color="000000" w:sz="4"/>
-              <w:bottom w:val="single" w:color="000000" w:sz="4"/>
-              <w:right w:val="single" w:color="000000" w:sz="4"/>
-            </w:tcBorders>
-            <w:tcMar>
-              <w:top w:type="dxa" w:w="60"/>
-              <w:left w:type="dxa" w:w="90"/>
-              <w:bottom w:type="dxa" w:w="60"/>
-              <w:right w:type="dxa" w:w="90"/>
-            </w:tcMar>
-          </w:tcPr>
-          <w:p>
-            <w:r>
-              <w:rPr>
-                <w:rFonts w:ascii="Times New Roman" w:cs="Times New Roman" w:eastAsia="Times New Roman" w:hAnsi="Times New Roman"/>
-                <w:b w:val="false"/>
-                <w:bCs w:val="false"/>
-                <w:sz w:val="20"/>
-                <w:szCs w:val="20"/>
-              </w:rPr>
-              <w:t xml:space="preserve">Mega-study: green-energy paradigm, treated as novel by the authors</w:t>
-            </w:r>
-          </w:p>
-        </w:tc>
-        <w:tc>
-          <w:tcPr>
-            <w:tcW w:type="dxa" w:w="1760"/>
+              <w:t xml:space="preserve">Mega-study green energy (n = 600), treated as novel by its authors: 60.7% vs. 36.0%, difference 24.7 pp, CI 16.9 to 32.4, d ≈ 0.56</w:t>
+            </w:r>
+          </w:p>
+        </w:tc>
+        <w:tc>
+          <w:tcPr>
+            <w:tcW w:type="dxa" w:w="1560"/>
             <w:tcBorders>
               <w:top w:val="single" w:color="000000" w:sz="4"/>
               <w:left w:val="single" w:color="000000" w:sz="4"/>
@@ -1693,7 +1693,7 @@
         </w:trPr>
         <w:tc>
           <w:tcPr>
-            <w:tcW w:type="dxa" w:w="1450"/>
+            <w:tcW w:type="dxa" w:w="1250"/>
             <w:tcBorders>
               <w:top w:val="single" w:color="000000" w:sz="4"/>
               <w:left w:val="single" w:color="000000" w:sz="4"/>
@@ -1722,6 +1722,35 @@
         </w:tc>
         <w:tc>
           <w:tcPr>
+            <w:tcW w:type="dxa" w:w="3300"/>
+            <w:tcBorders>
+              <w:top w:val="single" w:color="000000" w:sz="4"/>
+              <w:left w:val="single" w:color="000000" w:sz="4"/>
+              <w:bottom w:val="single" w:color="000000" w:sz="4"/>
+              <w:right w:val="single" w:color="000000" w:sz="4"/>
+            </w:tcBorders>
+            <w:tcMar>
+              <w:top w:type="dxa" w:w="60"/>
+              <w:left w:type="dxa" w:w="90"/>
+              <w:bottom w:type="dxa" w:w="60"/>
+              <w:right w:type="dxa" w:w="90"/>
+            </w:tcMar>
+          </w:tcPr>
+          <w:p>
+            <w:r>
+              <w:rPr>
+                <w:rFonts w:ascii="Times New Roman" w:cs="Times New Roman" w:eastAsia="Times New Roman" w:hAnsi="Times New Roman"/>
+                <w:b w:val="false"/>
+                <w:bCs w:val="false"/>
+                <w:sz w:val="20"/>
+                <w:szCs w:val="20"/>
+              </w:rPr>
+              <w:t xml:space="preserve">Twin-2K-500: two numerical anchoring items (waves 2 and 4); Many Labs</w:t>
+            </w:r>
+          </w:p>
+        </w:tc>
+        <w:tc>
+          <w:tcPr>
             <w:tcW w:type="dxa" w:w="3250"/>
             <w:tcBorders>
               <w:top w:val="single" w:color="000000" w:sz="4"/>
@@ -1745,42 +1774,13 @@
                 <w:sz w:val="20"/>
                 <w:szCs w:val="20"/>
               </w:rPr>
-              <w:t xml:space="preserve">Twin-2K-500: two numerical anchoring items (waves 2 and 4); Many Labs</w:t>
-            </w:r>
-          </w:p>
-        </w:tc>
-        <w:tc>
-          <w:tcPr>
-            <w:tcW w:type="dxa" w:w="2900"/>
-            <w:tcBorders>
-              <w:top w:val="single" w:color="000000" w:sz="4"/>
-              <w:left w:val="single" w:color="000000" w:sz="4"/>
-              <w:bottom w:val="single" w:color="000000" w:sz="4"/>
-              <w:right w:val="single" w:color="000000" w:sz="4"/>
-            </w:tcBorders>
-            <w:tcMar>
-              <w:top w:type="dxa" w:w="60"/>
-              <w:left w:type="dxa" w:w="90"/>
-              <w:bottom w:type="dxa" w:w="60"/>
-              <w:right w:type="dxa" w:w="90"/>
-            </w:tcMar>
-          </w:tcPr>
-          <w:p>
-            <w:r>
-              <w:rPr>
-                <w:rFonts w:ascii="Times New Roman" w:cs="Times New Roman" w:eastAsia="Times New Roman" w:hAnsi="Times New Roman"/>
-                <w:b w:val="false"/>
-                <w:bCs w:val="false"/>
-                <w:sz w:val="20"/>
-                <w:szCs w:val="20"/>
-              </w:rPr>
               <w:t xml:space="preserve">None identified</w:t>
             </w:r>
           </w:p>
         </w:tc>
         <w:tc>
           <w:tcPr>
-            <w:tcW w:type="dxa" w:w="1760"/>
+            <w:tcW w:type="dxa" w:w="1560"/>
             <w:tcBorders>
               <w:top w:val="single" w:color="000000" w:sz="4"/>
               <w:left w:val="single" w:color="000000" w:sz="4"/>
@@ -1814,7 +1814,7 @@
         </w:trPr>
         <w:tc>
           <w:tcPr>
-            <w:tcW w:type="dxa" w:w="1450"/>
+            <w:tcW w:type="dxa" w:w="1250"/>
             <w:tcBorders>
               <w:top w:val="single" w:color="000000" w:sz="4"/>
               <w:left w:val="single" w:color="000000" w:sz="4"/>
@@ -1843,6 +1843,35 @@
         </w:tc>
         <w:tc>
           <w:tcPr>
+            <w:tcW w:type="dxa" w:w="3300"/>
+            <w:tcBorders>
+              <w:top w:val="single" w:color="000000" w:sz="4"/>
+              <w:left w:val="single" w:color="000000" w:sz="4"/>
+              <w:bottom w:val="single" w:color="000000" w:sz="4"/>
+              <w:right w:val="single" w:color="000000" w:sz="4"/>
+            </w:tcBorders>
+            <w:tcMar>
+              <w:top w:type="dxa" w:w="60"/>
+              <w:left w:type="dxa" w:w="90"/>
+              <w:bottom w:type="dxa" w:w="60"/>
+              <w:right w:type="dxa" w:w="90"/>
+            </w:tcMar>
+          </w:tcPr>
+          <w:p>
+            <w:r>
+              <w:rPr>
+                <w:rFonts w:ascii="Times New Roman" w:cs="Times New Roman" w:eastAsia="Times New Roman" w:hAnsi="Times New Roman"/>
+                <w:b w:val="false"/>
+                <w:bCs w:val="false"/>
+                <w:sz w:val="20"/>
+                <w:szCs w:val="20"/>
+              </w:rPr>
+              <w:t xml:space="preserve">Not in public data (no classic decoy stimuli); Huber et al. (1982) original</w:t>
+            </w:r>
+          </w:p>
+        </w:tc>
+        <w:tc>
+          <w:tcPr>
             <w:tcW w:type="dxa" w:w="3250"/>
             <w:tcBorders>
               <w:top w:val="single" w:color="000000" w:sz="4"/>
@@ -1866,65 +1895,36 @@
                 <w:sz w:val="20"/>
                 <w:szCs w:val="20"/>
               </w:rPr>
-              <w:t xml:space="preserve">Mega-study: attraction and compromise effects</w:t>
-            </w:r>
-          </w:p>
-        </w:tc>
-        <w:tc>
-          <w:tcPr>
-            <w:tcW w:type="dxa" w:w="2900"/>
-            <w:tcBorders>
-              <w:top w:val="single" w:color="000000" w:sz="4"/>
-              <w:left w:val="single" w:color="000000" w:sz="4"/>
-              <w:bottom w:val="single" w:color="000000" w:sz="4"/>
-              <w:right w:val="single" w:color="000000" w:sz="4"/>
-            </w:tcBorders>
-            <w:tcMar>
-              <w:top w:type="dxa" w:w="60"/>
-              <w:left w:type="dxa" w:w="90"/>
-              <w:bottom w:type="dxa" w:w="60"/>
-              <w:right w:type="dxa" w:w="90"/>
-            </w:tcMar>
-          </w:tcPr>
-          <w:p>
-            <w:r>
-              <w:rPr>
-                <w:rFonts w:ascii="Times New Roman" w:cs="Times New Roman" w:eastAsia="Times New Roman" w:hAnsi="Times New Roman"/>
-                <w:b w:val="false"/>
-                <w:bCs w:val="false"/>
-                <w:sz w:val="20"/>
-                <w:szCs w:val="20"/>
-              </w:rPr>
-              <w:t xml:space="preserve">Mega-study: newly developed stimuli that twins could not have seen</w:t>
-            </w:r>
-          </w:p>
-        </w:tc>
-        <w:tc>
-          <w:tcPr>
-            <w:tcW w:type="dxa" w:w="1760"/>
-            <w:tcBorders>
-              <w:top w:val="single" w:color="000000" w:sz="4"/>
-              <w:left w:val="single" w:color="000000" w:sz="4"/>
-              <w:bottom w:val="single" w:color="000000" w:sz="4"/>
-              <w:right w:val="single" w:color="000000" w:sz="4"/>
-            </w:tcBorders>
-            <w:tcMar>
-              <w:top w:type="dxa" w:w="60"/>
-              <w:left w:type="dxa" w:w="90"/>
-              <w:bottom w:type="dxa" w:w="60"/>
-              <w:right w:type="dxa" w:w="90"/>
-            </w:tcMar>
-          </w:tcPr>
-          <w:p>
-            <w:r>
-              <w:rPr>
-                <w:rFonts w:ascii="Times New Roman" w:cs="Times New Roman" w:eastAsia="Times New Roman" w:hAnsi="Times New Roman"/>
-                <w:b w:val="false"/>
-                <w:bCs w:val="false"/>
-                <w:sz w:val="20"/>
-                <w:szCs w:val="20"/>
-              </w:rPr>
-              <w:t xml:space="preserve">Novel; classic stimuli to be added</w:t>
+              <w:t xml:space="preserve">Mega-study attraction effect, three newly built choice sets (about 165 per cell): pooled log odds ratio 0.37, CI 0.11 to 0.62, d ≈ 0.20</w:t>
+            </w:r>
+          </w:p>
+        </w:tc>
+        <w:tc>
+          <w:tcPr>
+            <w:tcW w:type="dxa" w:w="1560"/>
+            <w:tcBorders>
+              <w:top w:val="single" w:color="000000" w:sz="4"/>
+              <w:left w:val="single" w:color="000000" w:sz="4"/>
+              <w:bottom w:val="single" w:color="000000" w:sz="4"/>
+              <w:right w:val="single" w:color="000000" w:sz="4"/>
+            </w:tcBorders>
+            <w:tcMar>
+              <w:top w:type="dxa" w:w="60"/>
+              <w:left w:type="dxa" w:w="90"/>
+              <w:bottom w:type="dxa" w:w="60"/>
+              <w:right w:type="dxa" w:w="90"/>
+            </w:tcMar>
+          </w:tcPr>
+          <w:p>
+            <w:r>
+              <w:rPr>
+                <w:rFonts w:ascii="Times New Roman" w:cs="Times New Roman" w:eastAsia="Times New Roman" w:hAnsi="Times New Roman"/>
+                <w:b w:val="false"/>
+                <w:bCs w:val="false"/>
+                <w:sz w:val="20"/>
+                <w:szCs w:val="20"/>
+              </w:rPr>
+              <w:t xml:space="preserve">Novel only</w:t>
             </w:r>
           </w:p>
         </w:tc>
@@ -1935,7 +1935,7 @@
         </w:trPr>
         <w:tc>
           <w:tcPr>
-            <w:tcW w:type="dxa" w:w="1450"/>
+            <w:tcW w:type="dxa" w:w="1250"/>
             <w:tcBorders>
               <w:top w:val="single" w:color="000000" w:sz="4"/>
               <w:left w:val="single" w:color="000000" w:sz="4"/>
@@ -1964,6 +1964,35 @@
         </w:tc>
         <w:tc>
           <w:tcPr>
+            <w:tcW w:type="dxa" w:w="3300"/>
+            <w:tcBorders>
+              <w:top w:val="single" w:color="000000" w:sz="4"/>
+              <w:left w:val="single" w:color="000000" w:sz="4"/>
+              <w:bottom w:val="single" w:color="000000" w:sz="4"/>
+              <w:right w:val="single" w:color="000000" w:sz="4"/>
+            </w:tcBorders>
+            <w:tcMar>
+              <w:top w:type="dxa" w:w="60"/>
+              <w:left w:type="dxa" w:w="90"/>
+              <w:bottom w:type="dxa" w:w="60"/>
+              <w:right w:type="dxa" w:w="90"/>
+            </w:tcMar>
+          </w:tcPr>
+          <w:p>
+            <w:r>
+              <w:rPr>
+                <w:rFonts w:ascii="Times New Roman" w:cs="Times New Roman" w:eastAsia="Times New Roman" w:hAnsi="Times New Roman"/>
+                <w:b w:val="false"/>
+                <w:bCs w:val="false"/>
+                <w:sz w:val="20"/>
+                <w:szCs w:val="20"/>
+              </w:rPr>
+              <w:t xml:space="preserve">None identified; Scheibehenne et al. (2010) meta-analysis</w:t>
+            </w:r>
+          </w:p>
+        </w:tc>
+        <w:tc>
+          <w:tcPr>
             <w:tcW w:type="dxa" w:w="3250"/>
             <w:tcBorders>
               <w:top w:val="single" w:color="000000" w:sz="4"/>
@@ -1987,42 +2016,13 @@
                 <w:sz w:val="20"/>
                 <w:szCs w:val="20"/>
               </w:rPr>
-              <w:t xml:space="preserve">None identified; Scheibehenne et al. (2010) meta-analysis</w:t>
-            </w:r>
-          </w:p>
-        </w:tc>
-        <w:tc>
-          <w:tcPr>
-            <w:tcW w:type="dxa" w:w="2900"/>
-            <w:tcBorders>
-              <w:top w:val="single" w:color="000000" w:sz="4"/>
-              <w:left w:val="single" w:color="000000" w:sz="4"/>
-              <w:bottom w:val="single" w:color="000000" w:sz="4"/>
-              <w:right w:val="single" w:color="000000" w:sz="4"/>
-            </w:tcBorders>
-            <w:tcMar>
-              <w:top w:type="dxa" w:w="60"/>
-              <w:left w:type="dxa" w:w="90"/>
-              <w:bottom w:type="dxa" w:w="60"/>
-              <w:right w:type="dxa" w:w="90"/>
-            </w:tcMar>
-          </w:tcPr>
-          <w:p>
-            <w:r>
-              <w:rPr>
-                <w:rFonts w:ascii="Times New Roman" w:cs="Times New Roman" w:eastAsia="Times New Roman" w:hAnsi="Times New Roman"/>
-                <w:b w:val="false"/>
-                <w:bCs w:val="false"/>
-                <w:sz w:val="20"/>
-                <w:szCs w:val="20"/>
-              </w:rPr>
               <w:t xml:space="preserve">None identified</w:t>
             </w:r>
           </w:p>
         </w:tc>
         <w:tc>
           <w:tcPr>
-            <w:tcW w:type="dxa" w:w="1760"/>
+            <w:tcW w:type="dxa" w:w="1560"/>
             <w:tcBorders>
               <w:top w:val="single" w:color="000000" w:sz="4"/>
               <w:left w:val="single" w:color="000000" w:sz="4"/>
@@ -2056,7 +2056,7 @@
         </w:trPr>
         <w:tc>
           <w:tcPr>
-            <w:tcW w:type="dxa" w:w="1450"/>
+            <w:tcW w:type="dxa" w:w="1250"/>
             <w:tcBorders>
               <w:top w:val="single" w:color="000000" w:sz="4"/>
               <w:left w:val="single" w:color="000000" w:sz="4"/>
@@ -2085,6 +2085,35 @@
         </w:tc>
         <w:tc>
           <w:tcPr>
+            <w:tcW w:type="dxa" w:w="3300"/>
+            <w:tcBorders>
+              <w:top w:val="single" w:color="000000" w:sz="4"/>
+              <w:left w:val="single" w:color="000000" w:sz="4"/>
+              <w:bottom w:val="single" w:color="000000" w:sz="4"/>
+              <w:right w:val="single" w:color="000000" w:sz="4"/>
+            </w:tcBorders>
+            <w:tcMar>
+              <w:top w:type="dxa" w:w="60"/>
+              <w:left w:type="dxa" w:w="90"/>
+              <w:bottom w:type="dxa" w:w="60"/>
+              <w:right w:type="dxa" w:w="90"/>
+            </w:tcMar>
+          </w:tcPr>
+          <w:p>
+            <w:r>
+              <w:rPr>
+                <w:rFonts w:ascii="Times New Roman" w:cs="Times New Roman" w:eastAsia="Times New Roman" w:hAnsi="Times New Roman"/>
+                <w:b w:val="false"/>
+                <w:bCs w:val="false"/>
+                <w:sz w:val="20"/>
+                <w:szCs w:val="20"/>
+              </w:rPr>
+              <w:t xml:space="preserve">Twin-2K-500: ultimatum game, sender and receiver, with human retest</w:t>
+            </w:r>
+          </w:p>
+        </w:tc>
+        <w:tc>
+          <w:tcPr>
             <w:tcW w:type="dxa" w:w="3250"/>
             <w:tcBorders>
               <w:top w:val="single" w:color="000000" w:sz="4"/>
@@ -2108,42 +2137,13 @@
                 <w:sz w:val="20"/>
                 <w:szCs w:val="20"/>
               </w:rPr>
-              <w:t xml:space="preserve">Twin-2K-500: ultimatum game, sender and receiver, with human retest</w:t>
-            </w:r>
-          </w:p>
-        </w:tc>
-        <w:tc>
-          <w:tcPr>
-            <w:tcW w:type="dxa" w:w="2900"/>
-            <w:tcBorders>
-              <w:top w:val="single" w:color="000000" w:sz="4"/>
-              <w:left w:val="single" w:color="000000" w:sz="4"/>
-              <w:bottom w:val="single" w:color="000000" w:sz="4"/>
-              <w:right w:val="single" w:color="000000" w:sz="4"/>
-            </w:tcBorders>
-            <w:tcMar>
-              <w:top w:type="dxa" w:w="60"/>
-              <w:left w:type="dxa" w:w="90"/>
-              <w:bottom w:type="dxa" w:w="60"/>
-              <w:right w:type="dxa" w:w="90"/>
-            </w:tcMar>
-          </w:tcPr>
-          <w:p>
-            <w:r>
-              <w:rPr>
-                <w:rFonts w:ascii="Times New Roman" w:cs="Times New Roman" w:eastAsia="Times New Roman" w:hAnsi="Times New Roman"/>
-                <w:b w:val="false"/>
-                <w:bCs w:val="false"/>
-                <w:sz w:val="20"/>
-                <w:szCs w:val="20"/>
-              </w:rPr>
-              <w:t xml:space="preserve">Mega-study: targeting-fairness study (357 humans)</w:t>
-            </w:r>
-          </w:p>
-        </w:tc>
-        <w:tc>
-          <w:tcPr>
-            <w:tcW w:type="dxa" w:w="1760"/>
+              <w:t xml:space="preserve">Mega-study targeting fairness (n = 357): demographic targeting rated less fair than broad advertising, 6.38 vs. 7.47 on a 9-point scale, d = −0.54</w:t>
+            </w:r>
+          </w:p>
+        </w:tc>
+        <w:tc>
+          <w:tcPr>
+            <w:tcW w:type="dxa" w:w="1560"/>
             <w:tcBorders>
               <w:top w:val="single" w:color="000000" w:sz="4"/>
               <w:left w:val="single" w:color="000000" w:sz="4"/>
@@ -2188,7 +2188,7 @@
           <w:sz w:val="24"/>
           <w:szCs w:val="24"/>
         </w:rPr>
-        <w:t xml:space="preserve">Coverage is uneven, as Table 2 shows. Choice overload has no item-level human benchmark in either dataset, so for that phenomenon we compare only with meta-analytic estimates (Scheibehenne et al. 2010). For loss framing and anchoring, public data contain the classic paradigms but no matched novel paradigms, so the contamination test (H2) for those phenomena relies on published tests of context variation and is reported as secondary. The contamination test is primary for defaults, decoys, and fairness, where a matched or newly built paradigm has human data.</w:t>
+        <w:t xml:space="preserve">Benchmark values in Table 2 were computed by the authors from the public mega-study data with a script deposited with the paper (Appendix C), coding conditions from the displayed survey text. Coverage is uneven, as Table 2 shows. Choice overload has no item-level human benchmark in either dataset, so for that phenomenon we compare only with meta-analytic estimates (Scheibehenne et al. 2010). For loss framing and anchoring, public data contain the classic paradigms but no matched novel paradigms, so the contamination test (H2) for those phenomena relies on published tests of context variation and is reported as secondary. The contamination test is primary for defaults and fairness, where both a classic and a novel paradigm have human data. For decoys only novel stimuli have human data, so twin performance there tests fidelity on unseen stimuli but cannot be framed as a classic-versus-novel contrast.</w:t>
       </w:r>
     </w:p>
     <w:p>
@@ -2257,7 +2257,7 @@
           <w:sz w:val="24"/>
           <w:szCs w:val="24"/>
         </w:rPr>
-        <w:t xml:space="preserve"> is the ratio of twin to human effect size, with a bootstrap interval clustered by item. </w:t>
+        <w:t xml:space="preserve"> is the difference between twin and human effect sizes, with a bootstrap interval clustered by item, and the ratio is reported only when the human effect’s confidence interval excludes zero. This matters in practice: the human organ-donation default effect in the public data is close to zero (d ≈ 0.10, CI including 0), so a ratio would be unstable. </w:t>
       </w:r>
       <w:r>
         <w:rPr>
@@ -2553,7 +2553,7 @@
                 <w:sz w:val="20"/>
                 <w:szCs w:val="20"/>
               </w:rPr>
-              <w:t xml:space="preserve">Sign concordance; twin/human effect-size ratio among sign-correct cells, classic items</w:t>
+              <w:t xml:space="preserve">Sign concordance; twin − human effect-size difference among sign-correct cells, classic items</w:t>
             </w:r>
           </w:p>
         </w:tc>
@@ -2582,7 +2582,7 @@
                 <w:sz w:val="20"/>
                 <w:szCs w:val="20"/>
               </w:rPr>
-              <w:t xml:space="preserve">(a) Concordance ≥ 0.80 with exact 95% CI lower bound above 0.50; (b) ratio &gt; 1</w:t>
+              <w:t xml:space="preserve">(a) Concordance ≥ 0.80 with exact 95% CI lower bound above 0.50; (b) twin − human difference &gt; 0</w:t>
             </w:r>
           </w:p>
         </w:tc>
@@ -2611,7 +2611,7 @@
                 <w:sz w:val="20"/>
                 <w:szCs w:val="20"/>
               </w:rPr>
-              <w:t xml:space="preserve">(a) and (b) hold; ratio CI excludes 1</w:t>
+              <w:t xml:space="preserve">(a) and (b) hold; difference CI excludes 0</w:t>
             </w:r>
           </w:p>
         </w:tc>

</xml_diff>

<commit_message>
Add framing and anchoring human benchmarks from Twin-2K-500 to Table 2
Co-Authored-By: Claude Sonnet 5.5 <noreply@anthropic.com>
Claude-Session: https://claude.ai/code/session_01UvKcabfwJpaPKKhavR8Tdw
</commit_message>
<xml_diff>
--- a/ISR_Digital_Twins_Behavioral_Econ_Paper_v3.docx
+++ b/ISR_Digital_Twins_Behavioral_Econ_Paper_v3.docx
@@ -1503,7 +1503,7 @@
                 <w:sz w:val="20"/>
                 <w:szCs w:val="20"/>
               </w:rPr>
-              <w:t xml:space="preserve">Twin-2K-500: gain/loss framing problem (waves 2 and 4); Brown et al. (2024) meta-analysis</w:t>
+              <w:t xml:space="preserve">Twin-2K-500 gain/loss framing problem (n = 2,058; about 1,000 per frame): preference for the risky program, loss vs. gain frame, d = 0.77, 95% CI 0.68 to 0.86; retest wave d = 0.76; Brown et al. (2024)</w:t>
             </w:r>
           </w:p>
         </w:tc>
@@ -1745,7 +1745,7 @@
                 <w:sz w:val="20"/>
                 <w:szCs w:val="20"/>
               </w:rPr>
-              <w:t xml:space="preserve">Twin-2K-500: two numerical anchoring items (waves 2 and 4); Many Labs</w:t>
+              <w:t xml:space="preserve">Twin-2K-500 anchoring, high vs. low anchor on log estimates: African UN members d = 0.72 (retest 0.78); redwood height d = 1.49 (retest 1.69); Many Labs</w:t>
             </w:r>
           </w:p>
         </w:tc>
@@ -2188,7 +2188,7 @@
           <w:sz w:val="24"/>
           <w:szCs w:val="24"/>
         </w:rPr>
-        <w:t xml:space="preserve">Benchmark values in Table 2 were computed by the authors from the public mega-study data with a script deposited with the paper (Appendix C), coding conditions from the displayed survey text. Coverage is uneven, as Table 2 shows. Choice overload has no item-level human benchmark in either dataset, so for that phenomenon we compare only with meta-analytic estimates (Scheibehenne et al. 2010). For loss framing and anchoring, public data contain the classic paradigms but no matched novel paradigms, so the contamination test (H2) for those phenomena relies on published tests of context variation and is reported as secondary. The contamination test is primary for defaults and fairness, where both a classic and a novel paradigm have human data. For decoys only novel stimuli have human data, so twin performance there tests fidelity on unseen stimuli but cannot be framed as a classic-versus-novel contrast.</w:t>
+        <w:t xml:space="preserve">The Twin-2K-500 repeat wave shows that these human effects are stable on retest, which gives a human noise ceiling for the magnitude comparison. Benchmark values in Table 2 were computed by the authors from the public mega-study data with a script deposited with the paper (Appendix C), coding conditions from the displayed survey text. Coverage is uneven, as Table 2 shows. Choice overload has no item-level human benchmark in either dataset, so for that phenomenon we compare only with meta-analytic estimates (Scheibehenne et al. 2010). For loss framing and anchoring, public data contain the classic paradigms but no matched novel paradigms, so the contamination test (H2) for those phenomena relies on published tests of context variation and is reported as secondary. The contamination test is primary for defaults and fairness, where both a classic and a novel paradigm have human data. For decoys only novel stimuli have human data, so twin performance there tests fidelity on unseen stimuli but cannot be framed as a classic-versus-novel contrast.</w:t>
       </w:r>
     </w:p>
     <w:p>

</xml_diff>

<commit_message>
Drop choice overload; study five phenomena
Co-Authored-By: Claude Sonnet 5.5 <noreply@anthropic.com>
Claude-Session: https://claude.ai/code/session_01UvKcabfwJpaPKKhavR8Tdw
</commit_message>
<xml_diff>
--- a/ISR_Digital_Twins_Behavioral_Econ_Paper_v3.docx
+++ b/ISR_Digital_Twins_Behavioral_Econ_Paper_v3.docx
@@ -44,7 +44,7 @@
           <w:sz w:val="24"/>
           <w:szCs w:val="24"/>
         </w:rPr>
-        <w:t xml:space="preserve">Large language model (LLM) digital twins are increasingly proposed as low-cost substitutes for human subjects in information systems (IS) research and platform design, yet validation has centered on whether twins reproduce the direction of classic effects. We argue that using twins for design science and theory testing requires theoretical fidelity: recovery of effect magnitudes, moderator interactions, and behavior on stimuli the model cannot have memorized. We develop a pre-registered, contamination-controlled design that evaluates six behavioral economics phenomena (loss framing, defaults, anchoring, decoys, choice overload, ultimatum-game fairness) across three twin architectures, classic, isomorphic, post-cutoff, and platform stimuli, and model training stage and resource constraints. Human benchmarks come solely from public replications and meta-analyses. We derive six hypotheses and decision rules, and contribute a fidelity framework, a reusable contamination test, and guidance on when synthetic agents may inform platform governance.</w:t>
+        <w:t xml:space="preserve">Large language model (LLM) digital twins are increasingly proposed as low-cost substitutes for human subjects in information systems (IS) research and platform design, yet validation has centered on whether twins reproduce the direction of classic effects. We argue that using twins for design science and theory testing requires theoretical fidelity: recovery of effect magnitudes, moderator interactions, and behavior on stimuli the model cannot have memorized. We develop a pre-registered, contamination-controlled design that evaluates five behavioral economics phenomena (loss framing, defaults, anchoring, decoys, ultimatum-game fairness) across three twin architectures, classic, isomorphic, post-cutoff, and platform stimuli, and model training stage and resource constraints. Human benchmarks come solely from public replications and meta-analyses. We derive six hypotheses and decision rules, and contribute a fidelity framework, a reusable contamination test, and guidance on when synthetic agents may inform platform governance.</w:t>
       </w:r>
     </w:p>
     <w:p>
@@ -167,7 +167,7 @@
           <w:sz w:val="24"/>
           <w:szCs w:val="24"/>
         </w:rPr>
-        <w:t xml:space="preserve">: whether they recover the magnitude, moderator structure, and boundary conditions that behavioral theory implies, on stimuli whose surface form is unlikely to appear in training data. We define theoretical fidelity along four separable dimensions (direction, magnitude, condition-dependence, and contamination-robustness) and develop a pre-registered design that measures each against public human benchmarks. The design covers six phenomena chosen for their effect-size literatures, differing replicability records, and relevance to platforms; three twin architectures; four stimulus classes; and variation in model training stage and inference-time resource constraints.</w:t>
+        <w:t xml:space="preserve">: whether they recover the magnitude, moderator structure, and boundary conditions that behavioral theory implies, on stimuli whose surface form is unlikely to appear in training data. We define theoretical fidelity along four separable dimensions (direction, magnitude, condition-dependence, and contamination-robustness) and develop a pre-registered design that measures each against public human benchmarks. The design covers five phenomena chosen for their effect-size literatures, differing replicability records, and relevance to platforms; three twin architectures; four stimulus classes; and variation in model training stage and inference-time resource constraints.</w:t>
       </w:r>
     </w:p>
     <w:p>
@@ -367,7 +367,7 @@
           <w:sz w:val="24"/>
           <w:szCs w:val="24"/>
         </w:rPr>
-        <w:t xml:space="preserve">. They also say little about platform-specific stimuli, which differ in surface form from laboratory materials. The closest prior work is the mega-study of Peng et al. (2026), which evaluates twins built from Twin-2K-500 across 19 pre-registered human studies. It finds that twins are hyper-rational, fail to reproduce the attraction effect on newly built stimuli, and reproduce a default effect for a classic paradigm but not for a novel one. We build on these findings in three ways. We organize them around theory-derived hypotheses for six phenomena, we estimate magnitudes and moderator recovery and not only significance, and we add a formal, human-benchmarked contamination test, multiple model families and stages, and platform items.</w:t>
+        <w:t xml:space="preserve">. They also say little about platform-specific stimuli, which differ in surface form from laboratory materials. The closest prior work is the mega-study of Peng et al. (2026), which evaluates twins built from Twin-2K-500 across 19 pre-registered human studies. It finds that twins are hyper-rational, fail to reproduce the attraction effect on newly built stimuli, and reproduce a default effect for a classic paradigm but not for a novel one. We build on these findings in three ways. We organize them around theory-derived hypotheses for five phenomena, we estimate magnitudes and moderator recovery and not only significance, and we add a formal, human-benchmarked contamination test, multiple model families and stages, and platform items.</w:t>
       </w:r>
     </w:p>
     <w:p>
@@ -400,7 +400,7 @@
           <w:sz w:val="24"/>
           <w:szCs w:val="24"/>
         </w:rPr>
-        <w:t xml:space="preserve">We study six constructs chosen for three reasons: (1) each has a substantial body of effect-size evidence, including meta-analyses or large-scale replications; (2) each is directly relevant to digital platform design; and (3) they vary in replicability, which permits internal contrast. Each is associated with mechanisms that generate predictions about whether and how an LLM should recover it.</w:t>
+        <w:t xml:space="preserve">We study five constructs chosen for three reasons: (1) each has a substantial body of effect-size evidence, including meta-analyses or large-scale replications; (2) each is directly relevant to digital platform design; and (3) they vary in replicability, which permits internal contrast. Each is associated with mechanisms that generate predictions about whether and how an LLM should recover it.</w:t>
       </w:r>
     </w:p>
     <w:p>
@@ -497,30 +497,6 @@
           <w:szCs w:val="24"/>
         </w:rPr>
         <w:t xml:space="preserve"> Adding an inferior option can raise the share of a target by changing the perceived similarity structure of the choice set (Huber et al. 1982). Recovery requires representing relational properties of the option set rather than absolute attribute values.</w:t>
-      </w:r>
-    </w:p>
-    <w:p>
-      <w:pPr>
-        <w:spacing w:line="480"/>
-        <w:ind w:firstLine="720"/>
-      </w:pPr>
-      <w:r>
-        <w:rPr>
-          <w:rFonts w:ascii="Times New Roman" w:cs="Times New Roman" w:eastAsia="Times New Roman" w:hAnsi="Times New Roman"/>
-          <w:b/>
-          <w:bCs/>
-          <w:sz w:val="24"/>
-          <w:szCs w:val="24"/>
-        </w:rPr>
-        <w:t xml:space="preserve">Choice overload.</w:t>
-      </w:r>
-      <w:r>
-        <w:rPr>
-          <w:rFonts w:ascii="Times New Roman" w:cs="Times New Roman" w:eastAsia="Times New Roman" w:hAnsi="Times New Roman"/>
-          <w:sz w:val="24"/>
-          <w:szCs w:val="24"/>
-        </w:rPr>
-        <w:t xml:space="preserve"> Large assortments can reduce choice probability or satisfaction (Iyengar and Lepper 2000), although the replication record is mixed, making this a useful contrast case. Resource-rational models predict overload when the cost of evaluating additional options exceeds the expected benefit (Lieder and Griffiths 2020).</w:t>
       </w:r>
     </w:p>
     <w:p>
@@ -832,7 +808,7 @@
           <w:sz w:val="24"/>
           <w:szCs w:val="24"/>
         </w:rPr>
-        <w:t xml:space="preserve"> if recovery partly reflects memorization of surface form, it should not transfer fully to rewritten stimuli (Section 2.4). Peng et al. (2026) report consistent preliminary evidence for defaults, and the public data show why classic paradigms are informative: the human organ-donation default effect is near zero in this sample (d ≈ 0.10), whereas twins show a strong effect, a pattern that memorization of the original finding would produce. We test this across all six phenomena.</w:t>
+        <w:t xml:space="preserve"> if recovery partly reflects memorization of surface form, it should not transfer fully to rewritten stimuli (Section 2.4). Peng et al. (2026) report consistent preliminary evidence for defaults, and the public data show why classic paradigms are informative: the human organ-donation default effect is near zero in this sample (d ≈ 0.10), whereas twins show a strong effect, a pattern that memorization of the original finding would produce. We test this across all five phenomena.</w:t>
       </w:r>
     </w:p>
     <w:p>
@@ -1958,127 +1934,6 @@
                 <w:sz w:val="20"/>
                 <w:szCs w:val="20"/>
               </w:rPr>
-              <w:t xml:space="preserve">Choice overload</w:t>
-            </w:r>
-          </w:p>
-        </w:tc>
-        <w:tc>
-          <w:tcPr>
-            <w:tcW w:type="dxa" w:w="3300"/>
-            <w:tcBorders>
-              <w:top w:val="single" w:color="000000" w:sz="4"/>
-              <w:left w:val="single" w:color="000000" w:sz="4"/>
-              <w:bottom w:val="single" w:color="000000" w:sz="4"/>
-              <w:right w:val="single" w:color="000000" w:sz="4"/>
-            </w:tcBorders>
-            <w:tcMar>
-              <w:top w:type="dxa" w:w="60"/>
-              <w:left w:type="dxa" w:w="90"/>
-              <w:bottom w:type="dxa" w:w="60"/>
-              <w:right w:type="dxa" w:w="90"/>
-            </w:tcMar>
-          </w:tcPr>
-          <w:p>
-            <w:r>
-              <w:rPr>
-                <w:rFonts w:ascii="Times New Roman" w:cs="Times New Roman" w:eastAsia="Times New Roman" w:hAnsi="Times New Roman"/>
-                <w:b w:val="false"/>
-                <w:bCs w:val="false"/>
-                <w:sz w:val="20"/>
-                <w:szCs w:val="20"/>
-              </w:rPr>
-              <w:t xml:space="preserve">None identified; Scheibehenne et al. (2010) meta-analysis</w:t>
-            </w:r>
-          </w:p>
-        </w:tc>
-        <w:tc>
-          <w:tcPr>
-            <w:tcW w:type="dxa" w:w="3250"/>
-            <w:tcBorders>
-              <w:top w:val="single" w:color="000000" w:sz="4"/>
-              <w:left w:val="single" w:color="000000" w:sz="4"/>
-              <w:bottom w:val="single" w:color="000000" w:sz="4"/>
-              <w:right w:val="single" w:color="000000" w:sz="4"/>
-            </w:tcBorders>
-            <w:tcMar>
-              <w:top w:type="dxa" w:w="60"/>
-              <w:left w:type="dxa" w:w="90"/>
-              <w:bottom w:type="dxa" w:w="60"/>
-              <w:right w:type="dxa" w:w="90"/>
-            </w:tcMar>
-          </w:tcPr>
-          <w:p>
-            <w:r>
-              <w:rPr>
-                <w:rFonts w:ascii="Times New Roman" w:cs="Times New Roman" w:eastAsia="Times New Roman" w:hAnsi="Times New Roman"/>
-                <w:b w:val="false"/>
-                <w:bCs w:val="false"/>
-                <w:sz w:val="20"/>
-                <w:szCs w:val="20"/>
-              </w:rPr>
-              <w:t xml:space="preserve">None identified</w:t>
-            </w:r>
-          </w:p>
-        </w:tc>
-        <w:tc>
-          <w:tcPr>
-            <w:tcW w:type="dxa" w:w="1560"/>
-            <w:tcBorders>
-              <w:top w:val="single" w:color="000000" w:sz="4"/>
-              <w:left w:val="single" w:color="000000" w:sz="4"/>
-              <w:bottom w:val="single" w:color="000000" w:sz="4"/>
-              <w:right w:val="single" w:color="000000" w:sz="4"/>
-            </w:tcBorders>
-            <w:tcMar>
-              <w:top w:type="dxa" w:w="60"/>
-              <w:left w:type="dxa" w:w="90"/>
-              <w:bottom w:type="dxa" w:w="60"/>
-              <w:right w:type="dxa" w:w="90"/>
-            </w:tcMar>
-          </w:tcPr>
-          <w:p>
-            <w:r>
-              <w:rPr>
-                <w:rFonts w:ascii="Times New Roman" w:cs="Times New Roman" w:eastAsia="Times New Roman" w:hAnsi="Times New Roman"/>
-                <w:b w:val="false"/>
-                <w:bCs w:val="false"/>
-                <w:sz w:val="20"/>
-                <w:szCs w:val="20"/>
-              </w:rPr>
-              <w:t xml:space="preserve">Meta-analytic only</w:t>
-            </w:r>
-          </w:p>
-        </w:tc>
-      </w:tr>
-      <w:tr>
-        <w:trPr>
-          <w:cantSplit/>
-        </w:trPr>
-        <w:tc>
-          <w:tcPr>
-            <w:tcW w:type="dxa" w:w="1250"/>
-            <w:tcBorders>
-              <w:top w:val="single" w:color="000000" w:sz="4"/>
-              <w:left w:val="single" w:color="000000" w:sz="4"/>
-              <w:bottom w:val="single" w:color="000000" w:sz="4"/>
-              <w:right w:val="single" w:color="000000" w:sz="4"/>
-            </w:tcBorders>
-            <w:tcMar>
-              <w:top w:type="dxa" w:w="60"/>
-              <w:left w:type="dxa" w:w="90"/>
-              <w:bottom w:type="dxa" w:w="60"/>
-              <w:right w:type="dxa" w:w="90"/>
-            </w:tcMar>
-          </w:tcPr>
-          <w:p>
-            <w:r>
-              <w:rPr>
-                <w:rFonts w:ascii="Times New Roman" w:cs="Times New Roman" w:eastAsia="Times New Roman" w:hAnsi="Times New Roman"/>
-                <w:b w:val="false"/>
-                <w:bCs w:val="false"/>
-                <w:sz w:val="20"/>
-                <w:szCs w:val="20"/>
-              </w:rPr>
               <w:t xml:space="preserve">Fairness</w:t>
             </w:r>
           </w:p>
@@ -2188,7 +2043,7 @@
           <w:sz w:val="24"/>
           <w:szCs w:val="24"/>
         </w:rPr>
-        <w:t xml:space="preserve">The Twin-2K-500 repeat wave shows that these human effects are stable on retest, which gives a human noise ceiling for the magnitude comparison. Benchmark values in Table 2 were computed by the authors from the public mega-study data with a script deposited with the paper (Appendix C), coding conditions from the displayed survey text. Coverage is uneven, as Table 2 shows. Choice overload has no item-level human benchmark in either dataset, so for that phenomenon we compare only with meta-analytic estimates (Scheibehenne et al. 2010). For loss framing and anchoring, public data contain the classic paradigms but no matched novel paradigms, so the contamination test (H2) for those phenomena relies on published tests of context variation and is reported as secondary. The contamination test is primary for defaults and fairness, where both a classic and a novel paradigm have human data. For decoys only novel stimuli have human data, so twin performance there tests fidelity on unseen stimuli but cannot be framed as a classic-versus-novel contrast.</w:t>
+        <w:t xml:space="preserve">The Twin-2K-500 repeat wave shows that these human effects are stable on retest, which gives a human noise ceiling for the magnitude comparison. Benchmark values in Table 2 were computed by the authors from the public mega-study data with a script deposited with the paper (Appendix C), coding conditions from the displayed survey text. Coverage is uneven, as Table 2 shows. For loss framing and anchoring, public data contain the classic paradigms but no matched novel paradigms, so the contamination test (H2) for those phenomena relies on published tests of context variation and is reported as secondary. The contamination test is primary for defaults and fairness, where both a classic and a novel paradigm have human data. For decoys only novel stimuli have human data, so twin performance there tests fidelity on unseen stimuli but cannot be framed as a classic-versus-novel contrast.</w:t>
       </w:r>
     </w:p>
     <w:p>
@@ -2325,7 +2180,7 @@
           <w:sz w:val="24"/>
           <w:szCs w:val="24"/>
         </w:rPr>
-        <w:t xml:space="preserve">Table 1 gives the operational decision rule for each hypothesis. Thresholds are fixed before any model output is inspected. Because the design involves many phenomenon–model–stimulus cells, we control the false discovery rate within each hypothesis family using the Benjamini–Hochberg procedure (Benjamini and Hochberg 1995) and report all cells irrespective of significance. Replicability differs across the six phenomena, so benchmark uncertainty is propagated into every comparison, and results are also reported separately for phenomena with strong and weak replication records. The pre-registration will be time-stamped before data generation (Nosek et al. 2018), and deviations will be documented.</w:t>
+        <w:t xml:space="preserve">Table 1 gives the operational decision rule for each hypothesis. Thresholds are fixed before any model output is inspected. Because the design involves many phenomenon–model–stimulus cells, we control the false discovery rate within each hypothesis family using the Benjamini–Hochberg procedure (Benjamini and Hochberg 1995) and report all cells irrespective of significance. Replicability differs across the five phenomena, so benchmark uncertainty is propagated into every comparison, and results are also reported separately for phenomena with strong and weak replication records. The pre-registration will be time-stamped before data generation (Nosek et al. 2018), and deviations will be documented.</w:t>
       </w:r>
     </w:p>
     <w:p>
@@ -3369,7 +3224,7 @@
           <w:sz w:val="24"/>
           <w:szCs w:val="24"/>
         </w:rPr>
-        <w:t xml:space="preserve">Several limitations bound the inferences. First, the platform items are matched to meta-analytic categories but not to the specific populations, stakes, and attention conditions of real platforms, so tests against meta-analytic intervals assess the plausibility of effect sizes, not their predictive accuracy for a given site. Second, public human data for novel paradigms exist only for some phenomena (Table 2). For loss framing and anchoring the contamination test rests on the assumption that human attenuation under cover-story change is captured by the published context-variation literature, and for choice overload no item-level human benchmark exists. We report these results as secondary. In addition, both item-level datasets draw on US online panels, so conclusions about fidelity are conditional on that population. Third, contamination control is necessarily incomplete, since training corpora are undisclosed and isomorphic items may still resemble training text. Fourth, models change rapidly, so results describe specific model versions, and we provide the design and code precisely so that tests can be repeated. Fifth, the human literature itself has known replicability problems, which we address through benchmark uncertainty and the strong/weak replication split. Finally, evidence of functional similarity between LLMs and human cognition does not establish common mechanisms.</w:t>
+        <w:t xml:space="preserve">Several limitations bound the inferences. First, the platform items are matched to meta-analytic categories but not to the specific populations, stakes, and attention conditions of real platforms, so tests against meta-analytic intervals assess the plausibility of effect sizes, not their predictive accuracy for a given site. Second, public human data for novel paradigms exist only for some phenomena (Table 2). For loss framing and anchoring the contamination test rests on the assumption that human attenuation under cover-story change is captured by the published context-variation literature. We report these results as secondary. In addition, both item-level datasets draw on US online panels, so conclusions about fidelity are conditional on that population. Third, contamination control is necessarily incomplete, since training corpora are undisclosed and isomorphic items may still resemble training text. Fourth, models change rapidly, so results describe specific model versions, and we provide the design and code precisely so that tests can be repeated. Fifth, the human literature itself has known replicability problems, which we address through benchmark uncertainty and the strong/weak replication split. Finally, evidence of functional similarity between LLMs and human cognition does not establish common mechanisms.</w:t>
       </w:r>
     </w:p>
     <w:p>
@@ -3572,7 +3427,7 @@
           <w:sz w:val="24"/>
           <w:szCs w:val="24"/>
         </w:rPr>
-        <w:t xml:space="preserve">Iyengar SS, Lepper MR (2000) When choice is demotivating: Can one desire too much of a good thing? J. Personality Soc. Psych. 79(6):995–1006.</w:t>
+        <w:t xml:space="preserve">Jachimowicz JM, Duncan S, Weber EU, Johnson EJ (2019) When and why defaults influence decisions: A meta-analysis of default effects. Behavioural Public Policy 3(2):159–186.</w:t>
       </w:r>
     </w:p>
     <w:p>
@@ -3586,7 +3441,7 @@
           <w:sz w:val="24"/>
           <w:szCs w:val="24"/>
         </w:rPr>
-        <w:t xml:space="preserve">Jachimowicz JM, Duncan S, Weber EU, Johnson EJ (2019) When and why defaults influence decisions: A meta-analysis of default effects. Behavioural Public Policy 3(2):159–186.</w:t>
+        <w:t xml:space="preserve">Ji Z, Lee N, Frieske R, et al. (2023) Survey of hallucination in natural language generation. ACM Comput. Surveys 55(12):1–38.</w:t>
       </w:r>
     </w:p>
     <w:p>
@@ -3600,7 +3455,7 @@
           <w:sz w:val="24"/>
           <w:szCs w:val="24"/>
         </w:rPr>
-        <w:t xml:space="preserve">Ji Z, Lee N, Frieske R, et al. (2023) Survey of hallucination in natural language generation. ACM Comput. Surveys 55(12):1–38.</w:t>
+        <w:t xml:space="preserve">Kahneman D (2011) Thinking, Fast and Slow (Farrar, Straus and Giroux, New York).</w:t>
       </w:r>
     </w:p>
     <w:p>
@@ -3614,7 +3469,7 @@
           <w:sz w:val="24"/>
           <w:szCs w:val="24"/>
         </w:rPr>
-        <w:t xml:space="preserve">Kahneman D (2011) Thinking, Fast and Slow (Farrar, Straus and Giroux, New York).</w:t>
+        <w:t xml:space="preserve">Kahneman D, Tversky A (1979) Prospect theory: An analysis of decision under risk. Econometrica 47(2):263–291.</w:t>
       </w:r>
     </w:p>
     <w:p>
@@ -3628,7 +3483,7 @@
           <w:sz w:val="24"/>
           <w:szCs w:val="24"/>
         </w:rPr>
-        <w:t xml:space="preserve">Kahneman D, Tversky A (1979) Prospect theory: An analysis of decision under risk. Econometrica 47(2):263–291.</w:t>
+        <w:t xml:space="preserve">Klein RA, Ratliff KA, Vianello M, et al. (2014) Investigating variation in replicability: A “many labs” replication project. Soc. Psych. 45(3):142–152.</w:t>
       </w:r>
     </w:p>
     <w:p>
@@ -3642,7 +3497,7 @@
           <w:sz w:val="24"/>
           <w:szCs w:val="24"/>
         </w:rPr>
-        <w:t xml:space="preserve">Klein RA, Ratliff KA, Vianello M, et al. (2014) Investigating variation in replicability: A “many labs” replication project. Soc. Psych. 45(3):142–152.</w:t>
+        <w:t xml:space="preserve">Klein RA, Vianello M, Hasselman F, et al. (2018) Many Labs 2: Investigating variation in replicability across samples and settings. Adv. Methods Practices Psych. Sci. 1(4):443–490.</w:t>
       </w:r>
     </w:p>
     <w:p>
@@ -3656,7 +3511,7 @@
           <w:sz w:val="24"/>
           <w:szCs w:val="24"/>
         </w:rPr>
-        <w:t xml:space="preserve">Klein RA, Vianello M, Hasselman F, et al. (2018) Many Labs 2: Investigating variation in replicability across samples and settings. Adv. Methods Practices Psych. Sci. 1(4):443–490.</w:t>
+        <w:t xml:space="preserve">Lieder F, Griffiths TL (2020) Resource-rational analysis: Understanding human cognition as the optimal use of limited computational resources. Behav. Brain Sci. 43:e1.</w:t>
       </w:r>
     </w:p>
     <w:p>
@@ -3670,7 +3525,7 @@
           <w:sz w:val="24"/>
           <w:szCs w:val="24"/>
         </w:rPr>
-        <w:t xml:space="preserve">Lieder F, Griffiths TL (2020) Resource-rational analysis: Understanding human cognition as the optimal use of limited computational resources. Behav. Brain Sci. 43:e1.</w:t>
+        <w:t xml:space="preserve">Louie K, Khaw MW, Glimcher PW (2013) Normalization is a general neural mechanism for context-dependent decision making. Proc. Natl. Acad. Sci. USA 110(15):6139–6144.</w:t>
       </w:r>
     </w:p>
     <w:p>
@@ -3684,7 +3539,7 @@
           <w:sz w:val="24"/>
           <w:szCs w:val="24"/>
         </w:rPr>
-        <w:t xml:space="preserve">Louie K, Khaw MW, Glimcher PW (2013) Normalization is a general neural mechanism for context-dependent decision making. Proc. Natl. Acad. Sci. USA 110(15):6139–6144.</w:t>
+        <w:t xml:space="preserve">Mathur A, Acar G, Friedman MJ, et al. (2019) Dark patterns at scale: Findings from a crawl of 11K shopping websites. Proc. ACM Human-Computer Interaction 3(CSCW):81.</w:t>
       </w:r>
     </w:p>
     <w:p>
@@ -3698,7 +3553,7 @@
           <w:sz w:val="24"/>
           <w:szCs w:val="24"/>
         </w:rPr>
-        <w:t xml:space="preserve">Mathur A, Acar G, Friedman MJ, et al. (2019) Dark patterns at scale: Findings from a crawl of 11K shopping websites. Proc. ACM Human-Computer Interaction 3(CSCW):81.</w:t>
+        <w:t xml:space="preserve">Nosek BA, Ebersole CR, DeHaven AC, Mellor DT (2018) The preregistration revolution. Proc. Natl. Acad. Sci. USA 115(11):2600–2605.</w:t>
       </w:r>
     </w:p>
     <w:p>
@@ -3712,35 +3567,7 @@
           <w:sz w:val="24"/>
           <w:szCs w:val="24"/>
         </w:rPr>
-        <w:t xml:space="preserve">Nosek BA, Ebersole CR, DeHaven AC, Mellor DT (2018) The preregistration revolution. Proc. Natl. Acad. Sci. USA 115(11):2600–2605.</w:t>
-      </w:r>
-    </w:p>
-    <w:p>
-      <w:pPr>
-        <w:spacing w:line="480"/>
-        <w:ind w:left="720" w:hanging="720"/>
-      </w:pPr>
-      <w:r>
-        <w:rPr>
-          <w:rFonts w:ascii="Times New Roman" w:cs="Times New Roman" w:eastAsia="Times New Roman" w:hAnsi="Times New Roman"/>
-          <w:sz w:val="24"/>
-          <w:szCs w:val="24"/>
-        </w:rPr>
         <w:t xml:space="preserve">Peng T, Gui G, Brucks M, et al. (2026) Digital twins are funhouse mirrors: Five systematic distortions. Preprint, submitted September 19, arXiv:2509.19088.</w:t>
-      </w:r>
-    </w:p>
-    <w:p>
-      <w:pPr>
-        <w:spacing w:line="480"/>
-        <w:ind w:left="720" w:hanging="720"/>
-      </w:pPr>
-      <w:r>
-        <w:rPr>
-          <w:rFonts w:ascii="Times New Roman" w:cs="Times New Roman" w:eastAsia="Times New Roman" w:hAnsi="Times New Roman"/>
-          <w:sz w:val="24"/>
-          <w:szCs w:val="24"/>
-        </w:rPr>
-        <w:t xml:space="preserve">Scheibehenne B, Greifeneder R, Todd PM (2010) Can there ever be too many options? A meta-analytic review of choice overload. J. Consumer Res. 37(3):409–425.</w:t>
       </w:r>
     </w:p>
     <w:p>

</xml_diff>

<commit_message>
Add pilot twin-vs-human framing and anchoring results from public simulations
Co-Authored-By: Claude Sonnet 5.5 <noreply@anthropic.com>
Claude-Session: https://claude.ai/code/session_01UvKcabfwJpaPKKhavR8Tdw
</commit_message>
<xml_diff>
--- a/ISR_Digital_Twins_Behavioral_Econ_Paper_v3.docx
+++ b/ISR_Digital_Twins_Behavioral_Econ_Paper_v3.docx
@@ -3101,6 +3101,25 @@
     </w:p>
     <w:p>
       <w:pPr>
+        <w:pStyle w:val="Heading2"/>
+        <w:keepNext/>
+        <w:spacing w:after="0" w:before="120" w:line="480"/>
+      </w:pPr>
+      <w:r>
+        <w:rPr>
+          <w:rFonts w:ascii="Times New Roman" w:cs="Times New Roman" w:eastAsia="Times New Roman" w:hAnsi="Times New Roman"/>
+          <w:b/>
+          <w:bCs/>
+          <w:i/>
+          <w:iCs/>
+          <w:sz w:val="24"/>
+          <w:szCs w:val="24"/>
+        </w:rPr>
+        <w:t xml:space="preserve">4.1 Pilot Evidence from Public Twin Simulations</w:t>
+      </w:r>
+    </w:p>
+    <w:p>
+      <w:pPr>
         <w:spacing w:line="480"/>
         <w:ind w:firstLine="720"/>
       </w:pPr>
@@ -3110,7 +3129,689 @@
           <w:sz w:val="24"/>
           <w:szCs w:val="24"/>
         </w:rPr>
-        <w:t xml:space="preserve">[This section is to be completed after data generation. It should follow the order of Table 1: (i) directional and magnitude recovery by phenomenon, model, and twin architecture (Figure 1, forest plot of twin-to-human effect-size ratios); (ii) interaction and heterogeneity recovery; (iii) the contamination test by phenomenon and stimulus class; (iv) platform-item comparison with meta-analytic intervals and rank-order correlation; (v) training-stage and resource-constraint effects and their covariation with hallucination rates. Each hypothesis should be reported as supported, partially supported, or not supported according to the pre-registered rule, and unsupported hypotheses should be reported with equal prominence. Robustness checks should include alternative prompt templates, alternative effect-size metrics, and exclusion of the most likely contaminated items.]</w:t>
+        <w:t xml:space="preserve">Before the pre-registered study, we computed the twin-side analogues of the Table 2 benchmarks for the paradigms where public twin simulations exist. The Twin-2K-500 release includes twin responses to the framing and anchoring items for the same 2,058 participants under several construction methods. We analyzed three of the published specifications: a demographics-only persona (GPT-4.1-mini), a JSON persona built from the participant’s earlier answers (GPT-4.1), and a text persona (Gemini 2.5 Flash). This is a pilot of existing simulations, not the pre-registered test, and it covers only the two phenomena with public twin outputs (Table 3).</w:t>
+      </w:r>
+    </w:p>
+    <w:p>
+      <w:pPr>
+        <w:keepNext/>
+        <w:spacing w:after="80" w:before="120"/>
+      </w:pPr>
+      <w:r>
+        <w:rPr>
+          <w:rFonts w:ascii="Times New Roman" w:cs="Times New Roman" w:eastAsia="Times New Roman" w:hAnsi="Times New Roman"/>
+          <w:b/>
+          <w:bCs/>
+          <w:sz w:val="22"/>
+          <w:szCs w:val="22"/>
+        </w:rPr>
+        <w:t xml:space="preserve">Table 3. </w:t>
+      </w:r>
+      <w:r>
+        <w:rPr>
+          <w:rFonts w:ascii="Times New Roman" w:cs="Times New Roman" w:eastAsia="Times New Roman" w:hAnsi="Times New Roman"/>
+          <w:sz w:val="22"/>
+          <w:szCs w:val="22"/>
+        </w:rPr>
+        <w:t xml:space="preserve">Standardized effect sizes (Cohen’s d) in humans and in public twin simulations</w:t>
+      </w:r>
+    </w:p>
+    <w:tbl>
+      <w:tblPr>
+        <w:tblW w:type="dxa" w:w="9360"/>
+        <w:tblBorders>
+          <w:top w:val="single" w:color="auto" w:sz="4"/>
+          <w:left w:val="single" w:color="auto" w:sz="4"/>
+          <w:bottom w:val="single" w:color="auto" w:sz="4"/>
+          <w:right w:val="single" w:color="auto" w:sz="4"/>
+          <w:insideH w:val="single" w:color="auto" w:sz="4"/>
+          <w:insideV w:val="single" w:color="auto" w:sz="4"/>
+        </w:tblBorders>
+      </w:tblPr>
+      <w:tblGrid>
+        <w:gridCol w:w="2200"/>
+        <w:gridCol w:w="1500"/>
+        <w:gridCol w:w="1900"/>
+        <w:gridCol w:w="1900"/>
+        <w:gridCol w:w="1860"/>
+      </w:tblGrid>
+      <w:tr>
+        <w:trPr>
+          <w:tblHeader/>
+        </w:trPr>
+        <w:tc>
+          <w:tcPr>
+            <w:tcW w:type="dxa" w:w="2200"/>
+            <w:tcBorders>
+              <w:top w:val="single" w:color="000000" w:sz="4"/>
+              <w:left w:val="single" w:color="000000" w:sz="4"/>
+              <w:bottom w:val="single" w:color="000000" w:sz="4"/>
+              <w:right w:val="single" w:color="000000" w:sz="4"/>
+            </w:tcBorders>
+            <w:shd w:fill="E7E7E7" w:color="auto" w:val="clear"/>
+            <w:tcMar>
+              <w:top w:type="dxa" w:w="60"/>
+              <w:left w:type="dxa" w:w="90"/>
+              <w:bottom w:type="dxa" w:w="60"/>
+              <w:right w:type="dxa" w:w="90"/>
+            </w:tcMar>
+          </w:tcPr>
+          <w:p>
+            <w:r>
+              <w:rPr>
+                <w:rFonts w:ascii="Times New Roman" w:cs="Times New Roman" w:eastAsia="Times New Roman" w:hAnsi="Times New Roman"/>
+                <w:b/>
+                <w:bCs/>
+                <w:sz w:val="20"/>
+                <w:szCs w:val="20"/>
+              </w:rPr>
+              <w:t xml:space="preserve">Effect</w:t>
+            </w:r>
+          </w:p>
+        </w:tc>
+        <w:tc>
+          <w:tcPr>
+            <w:tcW w:type="dxa" w:w="1500"/>
+            <w:tcBorders>
+              <w:top w:val="single" w:color="000000" w:sz="4"/>
+              <w:left w:val="single" w:color="000000" w:sz="4"/>
+              <w:bottom w:val="single" w:color="000000" w:sz="4"/>
+              <w:right w:val="single" w:color="000000" w:sz="4"/>
+            </w:tcBorders>
+            <w:shd w:fill="E7E7E7" w:color="auto" w:val="clear"/>
+            <w:tcMar>
+              <w:top w:type="dxa" w:w="60"/>
+              <w:left w:type="dxa" w:w="90"/>
+              <w:bottom w:type="dxa" w:w="60"/>
+              <w:right w:type="dxa" w:w="90"/>
+            </w:tcMar>
+          </w:tcPr>
+          <w:p>
+            <w:r>
+              <w:rPr>
+                <w:rFonts w:ascii="Times New Roman" w:cs="Times New Roman" w:eastAsia="Times New Roman" w:hAnsi="Times New Roman"/>
+                <w:b/>
+                <w:bCs/>
+                <w:sz w:val="20"/>
+                <w:szCs w:val="20"/>
+              </w:rPr>
+              <w:t xml:space="preserve">Human (wave 4)</w:t>
+            </w:r>
+          </w:p>
+        </w:tc>
+        <w:tc>
+          <w:tcPr>
+            <w:tcW w:type="dxa" w:w="1900"/>
+            <w:tcBorders>
+              <w:top w:val="single" w:color="000000" w:sz="4"/>
+              <w:left w:val="single" w:color="000000" w:sz="4"/>
+              <w:bottom w:val="single" w:color="000000" w:sz="4"/>
+              <w:right w:val="single" w:color="000000" w:sz="4"/>
+            </w:tcBorders>
+            <w:shd w:fill="E7E7E7" w:color="auto" w:val="clear"/>
+            <w:tcMar>
+              <w:top w:type="dxa" w:w="60"/>
+              <w:left w:type="dxa" w:w="90"/>
+              <w:bottom w:type="dxa" w:w="60"/>
+              <w:right w:type="dxa" w:w="90"/>
+            </w:tcMar>
+          </w:tcPr>
+          <w:p>
+            <w:r>
+              <w:rPr>
+                <w:rFonts w:ascii="Times New Roman" w:cs="Times New Roman" w:eastAsia="Times New Roman" w:hAnsi="Times New Roman"/>
+                <w:b/>
+                <w:bCs/>
+                <w:sz w:val="20"/>
+                <w:szCs w:val="20"/>
+              </w:rPr>
+              <w:t xml:space="preserve">Demographics only, GPT-4.1-mini</w:t>
+            </w:r>
+          </w:p>
+        </w:tc>
+        <w:tc>
+          <w:tcPr>
+            <w:tcW w:type="dxa" w:w="1900"/>
+            <w:tcBorders>
+              <w:top w:val="single" w:color="000000" w:sz="4"/>
+              <w:left w:val="single" w:color="000000" w:sz="4"/>
+              <w:bottom w:val="single" w:color="000000" w:sz="4"/>
+              <w:right w:val="single" w:color="000000" w:sz="4"/>
+            </w:tcBorders>
+            <w:shd w:fill="E7E7E7" w:color="auto" w:val="clear"/>
+            <w:tcMar>
+              <w:top w:type="dxa" w:w="60"/>
+              <w:left w:type="dxa" w:w="90"/>
+              <w:bottom w:type="dxa" w:w="60"/>
+              <w:right w:type="dxa" w:w="90"/>
+            </w:tcMar>
+          </w:tcPr>
+          <w:p>
+            <w:r>
+              <w:rPr>
+                <w:rFonts w:ascii="Times New Roman" w:cs="Times New Roman" w:eastAsia="Times New Roman" w:hAnsi="Times New Roman"/>
+                <w:b/>
+                <w:bCs/>
+                <w:sz w:val="20"/>
+                <w:szCs w:val="20"/>
+              </w:rPr>
+              <w:t xml:space="preserve">JSON persona, GPT-4.1</w:t>
+            </w:r>
+          </w:p>
+        </w:tc>
+        <w:tc>
+          <w:tcPr>
+            <w:tcW w:type="dxa" w:w="1860"/>
+            <w:tcBorders>
+              <w:top w:val="single" w:color="000000" w:sz="4"/>
+              <w:left w:val="single" w:color="000000" w:sz="4"/>
+              <w:bottom w:val="single" w:color="000000" w:sz="4"/>
+              <w:right w:val="single" w:color="000000" w:sz="4"/>
+            </w:tcBorders>
+            <w:shd w:fill="E7E7E7" w:color="auto" w:val="clear"/>
+            <w:tcMar>
+              <w:top w:type="dxa" w:w="60"/>
+              <w:left w:type="dxa" w:w="90"/>
+              <w:bottom w:type="dxa" w:w="60"/>
+              <w:right w:type="dxa" w:w="90"/>
+            </w:tcMar>
+          </w:tcPr>
+          <w:p>
+            <w:r>
+              <w:rPr>
+                <w:rFonts w:ascii="Times New Roman" w:cs="Times New Roman" w:eastAsia="Times New Roman" w:hAnsi="Times New Roman"/>
+                <w:b/>
+                <w:bCs/>
+                <w:sz w:val="20"/>
+                <w:szCs w:val="20"/>
+              </w:rPr>
+              <w:t xml:space="preserve">Text persona, Gemini 2.5 Flash</w:t>
+            </w:r>
+          </w:p>
+        </w:tc>
+      </w:tr>
+      <w:tr>
+        <w:trPr>
+          <w:cantSplit/>
+        </w:trPr>
+        <w:tc>
+          <w:tcPr>
+            <w:tcW w:type="dxa" w:w="2200"/>
+            <w:tcBorders>
+              <w:top w:val="single" w:color="000000" w:sz="4"/>
+              <w:left w:val="single" w:color="000000" w:sz="4"/>
+              <w:bottom w:val="single" w:color="000000" w:sz="4"/>
+              <w:right w:val="single" w:color="000000" w:sz="4"/>
+            </w:tcBorders>
+            <w:tcMar>
+              <w:top w:type="dxa" w:w="60"/>
+              <w:left w:type="dxa" w:w="90"/>
+              <w:bottom w:type="dxa" w:w="60"/>
+              <w:right w:type="dxa" w:w="90"/>
+            </w:tcMar>
+          </w:tcPr>
+          <w:p>
+            <w:r>
+              <w:rPr>
+                <w:rFonts w:ascii="Times New Roman" w:cs="Times New Roman" w:eastAsia="Times New Roman" w:hAnsi="Times New Roman"/>
+                <w:b w:val="false"/>
+                <w:bCs w:val="false"/>
+                <w:sz w:val="20"/>
+                <w:szCs w:val="20"/>
+              </w:rPr>
+              <w:t xml:space="preserve">Loss framing (loss vs. gain)</w:t>
+            </w:r>
+          </w:p>
+        </w:tc>
+        <w:tc>
+          <w:tcPr>
+            <w:tcW w:type="dxa" w:w="1500"/>
+            <w:tcBorders>
+              <w:top w:val="single" w:color="000000" w:sz="4"/>
+              <w:left w:val="single" w:color="000000" w:sz="4"/>
+              <w:bottom w:val="single" w:color="000000" w:sz="4"/>
+              <w:right w:val="single" w:color="000000" w:sz="4"/>
+            </w:tcBorders>
+            <w:tcMar>
+              <w:top w:type="dxa" w:w="60"/>
+              <w:left w:type="dxa" w:w="90"/>
+              <w:bottom w:type="dxa" w:w="60"/>
+              <w:right w:type="dxa" w:w="90"/>
+            </w:tcMar>
+          </w:tcPr>
+          <w:p>
+            <w:r>
+              <w:rPr>
+                <w:rFonts w:ascii="Times New Roman" w:cs="Times New Roman" w:eastAsia="Times New Roman" w:hAnsi="Times New Roman"/>
+                <w:b w:val="false"/>
+                <w:bCs w:val="false"/>
+                <w:sz w:val="20"/>
+                <w:szCs w:val="20"/>
+              </w:rPr>
+              <w:t xml:space="preserve">0.76</w:t>
+            </w:r>
+          </w:p>
+        </w:tc>
+        <w:tc>
+          <w:tcPr>
+            <w:tcW w:type="dxa" w:w="1900"/>
+            <w:tcBorders>
+              <w:top w:val="single" w:color="000000" w:sz="4"/>
+              <w:left w:val="single" w:color="000000" w:sz="4"/>
+              <w:bottom w:val="single" w:color="000000" w:sz="4"/>
+              <w:right w:val="single" w:color="000000" w:sz="4"/>
+            </w:tcBorders>
+            <w:tcMar>
+              <w:top w:type="dxa" w:w="60"/>
+              <w:left w:type="dxa" w:w="90"/>
+              <w:bottom w:type="dxa" w:w="60"/>
+              <w:right w:type="dxa" w:w="90"/>
+            </w:tcMar>
+          </w:tcPr>
+          <w:p>
+            <w:r>
+              <w:rPr>
+                <w:rFonts w:ascii="Times New Roman" w:cs="Times New Roman" w:eastAsia="Times New Roman" w:hAnsi="Times New Roman"/>
+                <w:b w:val="false"/>
+                <w:bCs w:val="false"/>
+                <w:sz w:val="20"/>
+                <w:szCs w:val="20"/>
+              </w:rPr>
+              <w:t xml:space="preserve">2.05</w:t>
+            </w:r>
+          </w:p>
+        </w:tc>
+        <w:tc>
+          <w:tcPr>
+            <w:tcW w:type="dxa" w:w="1900"/>
+            <w:tcBorders>
+              <w:top w:val="single" w:color="000000" w:sz="4"/>
+              <w:left w:val="single" w:color="000000" w:sz="4"/>
+              <w:bottom w:val="single" w:color="000000" w:sz="4"/>
+              <w:right w:val="single" w:color="000000" w:sz="4"/>
+            </w:tcBorders>
+            <w:tcMar>
+              <w:top w:type="dxa" w:w="60"/>
+              <w:left w:type="dxa" w:w="90"/>
+              <w:bottom w:type="dxa" w:w="60"/>
+              <w:right w:type="dxa" w:w="90"/>
+            </w:tcMar>
+          </w:tcPr>
+          <w:p>
+            <w:r>
+              <w:rPr>
+                <w:rFonts w:ascii="Times New Roman" w:cs="Times New Roman" w:eastAsia="Times New Roman" w:hAnsi="Times New Roman"/>
+                <w:b w:val="false"/>
+                <w:bCs w:val="false"/>
+                <w:sz w:val="20"/>
+                <w:szCs w:val="20"/>
+              </w:rPr>
+              <w:t xml:space="preserve">2.16</w:t>
+            </w:r>
+          </w:p>
+        </w:tc>
+        <w:tc>
+          <w:tcPr>
+            <w:tcW w:type="dxa" w:w="1860"/>
+            <w:tcBorders>
+              <w:top w:val="single" w:color="000000" w:sz="4"/>
+              <w:left w:val="single" w:color="000000" w:sz="4"/>
+              <w:bottom w:val="single" w:color="000000" w:sz="4"/>
+              <w:right w:val="single" w:color="000000" w:sz="4"/>
+            </w:tcBorders>
+            <w:tcMar>
+              <w:top w:type="dxa" w:w="60"/>
+              <w:left w:type="dxa" w:w="90"/>
+              <w:bottom w:type="dxa" w:w="60"/>
+              <w:right w:type="dxa" w:w="90"/>
+            </w:tcMar>
+          </w:tcPr>
+          <w:p>
+            <w:r>
+              <w:rPr>
+                <w:rFonts w:ascii="Times New Roman" w:cs="Times New Roman" w:eastAsia="Times New Roman" w:hAnsi="Times New Roman"/>
+                <w:b w:val="false"/>
+                <w:bCs w:val="false"/>
+                <w:sz w:val="20"/>
+                <w:szCs w:val="20"/>
+              </w:rPr>
+              <w:t xml:space="preserve">2.40</w:t>
+            </w:r>
+          </w:p>
+        </w:tc>
+      </w:tr>
+      <w:tr>
+        <w:trPr>
+          <w:cantSplit/>
+        </w:trPr>
+        <w:tc>
+          <w:tcPr>
+            <w:tcW w:type="dxa" w:w="2200"/>
+            <w:tcBorders>
+              <w:top w:val="single" w:color="000000" w:sz="4"/>
+              <w:left w:val="single" w:color="000000" w:sz="4"/>
+              <w:bottom w:val="single" w:color="000000" w:sz="4"/>
+              <w:right w:val="single" w:color="000000" w:sz="4"/>
+            </w:tcBorders>
+            <w:tcMar>
+              <w:top w:type="dxa" w:w="60"/>
+              <w:left w:type="dxa" w:w="90"/>
+              <w:bottom w:type="dxa" w:w="60"/>
+              <w:right w:type="dxa" w:w="90"/>
+            </w:tcMar>
+          </w:tcPr>
+          <w:p>
+            <w:r>
+              <w:rPr>
+                <w:rFonts w:ascii="Times New Roman" w:cs="Times New Roman" w:eastAsia="Times New Roman" w:hAnsi="Times New Roman"/>
+                <w:b w:val="false"/>
+                <w:bCs w:val="false"/>
+                <w:sz w:val="20"/>
+                <w:szCs w:val="20"/>
+              </w:rPr>
+              <w:t xml:space="preserve">Anchoring: African UN members</w:t>
+            </w:r>
+          </w:p>
+        </w:tc>
+        <w:tc>
+          <w:tcPr>
+            <w:tcW w:type="dxa" w:w="1500"/>
+            <w:tcBorders>
+              <w:top w:val="single" w:color="000000" w:sz="4"/>
+              <w:left w:val="single" w:color="000000" w:sz="4"/>
+              <w:bottom w:val="single" w:color="000000" w:sz="4"/>
+              <w:right w:val="single" w:color="000000" w:sz="4"/>
+            </w:tcBorders>
+            <w:tcMar>
+              <w:top w:type="dxa" w:w="60"/>
+              <w:left w:type="dxa" w:w="90"/>
+              <w:bottom w:type="dxa" w:w="60"/>
+              <w:right w:type="dxa" w:w="90"/>
+            </w:tcMar>
+          </w:tcPr>
+          <w:p>
+            <w:r>
+              <w:rPr>
+                <w:rFonts w:ascii="Times New Roman" w:cs="Times New Roman" w:eastAsia="Times New Roman" w:hAnsi="Times New Roman"/>
+                <w:b w:val="false"/>
+                <w:bCs w:val="false"/>
+                <w:sz w:val="20"/>
+                <w:szCs w:val="20"/>
+              </w:rPr>
+              <w:t xml:space="preserve">0.78</w:t>
+            </w:r>
+          </w:p>
+        </w:tc>
+        <w:tc>
+          <w:tcPr>
+            <w:tcW w:type="dxa" w:w="1900"/>
+            <w:tcBorders>
+              <w:top w:val="single" w:color="000000" w:sz="4"/>
+              <w:left w:val="single" w:color="000000" w:sz="4"/>
+              <w:bottom w:val="single" w:color="000000" w:sz="4"/>
+              <w:right w:val="single" w:color="000000" w:sz="4"/>
+            </w:tcBorders>
+            <w:tcMar>
+              <w:top w:type="dxa" w:w="60"/>
+              <w:left w:type="dxa" w:w="90"/>
+              <w:bottom w:type="dxa" w:w="60"/>
+              <w:right w:type="dxa" w:w="90"/>
+            </w:tcMar>
+          </w:tcPr>
+          <w:p>
+            <w:r>
+              <w:rPr>
+                <w:rFonts w:ascii="Times New Roman" w:cs="Times New Roman" w:eastAsia="Times New Roman" w:hAnsi="Times New Roman"/>
+                <w:b w:val="false"/>
+                <w:bCs w:val="false"/>
+                <w:sz w:val="20"/>
+                <w:szCs w:val="20"/>
+              </w:rPr>
+              <w:t xml:space="preserve">0.56</w:t>
+            </w:r>
+          </w:p>
+        </w:tc>
+        <w:tc>
+          <w:tcPr>
+            <w:tcW w:type="dxa" w:w="1900"/>
+            <w:tcBorders>
+              <w:top w:val="single" w:color="000000" w:sz="4"/>
+              <w:left w:val="single" w:color="000000" w:sz="4"/>
+              <w:bottom w:val="single" w:color="000000" w:sz="4"/>
+              <w:right w:val="single" w:color="000000" w:sz="4"/>
+            </w:tcBorders>
+            <w:tcMar>
+              <w:top w:type="dxa" w:w="60"/>
+              <w:left w:type="dxa" w:w="90"/>
+              <w:bottom w:type="dxa" w:w="60"/>
+              <w:right w:type="dxa" w:w="90"/>
+            </w:tcMar>
+          </w:tcPr>
+          <w:p>
+            <w:r>
+              <w:rPr>
+                <w:rFonts w:ascii="Times New Roman" w:cs="Times New Roman" w:eastAsia="Times New Roman" w:hAnsi="Times New Roman"/>
+                <w:b w:val="false"/>
+                <w:bCs w:val="false"/>
+                <w:sz w:val="20"/>
+                <w:szCs w:val="20"/>
+              </w:rPr>
+              <w:t xml:space="preserve">1.31</w:t>
+            </w:r>
+          </w:p>
+        </w:tc>
+        <w:tc>
+          <w:tcPr>
+            <w:tcW w:type="dxa" w:w="1860"/>
+            <w:tcBorders>
+              <w:top w:val="single" w:color="000000" w:sz="4"/>
+              <w:left w:val="single" w:color="000000" w:sz="4"/>
+              <w:bottom w:val="single" w:color="000000" w:sz="4"/>
+              <w:right w:val="single" w:color="000000" w:sz="4"/>
+            </w:tcBorders>
+            <w:tcMar>
+              <w:top w:type="dxa" w:w="60"/>
+              <w:left w:type="dxa" w:w="90"/>
+              <w:bottom w:type="dxa" w:w="60"/>
+              <w:right w:type="dxa" w:w="90"/>
+            </w:tcMar>
+          </w:tcPr>
+          <w:p>
+            <w:r>
+              <w:rPr>
+                <w:rFonts w:ascii="Times New Roman" w:cs="Times New Roman" w:eastAsia="Times New Roman" w:hAnsi="Times New Roman"/>
+                <w:b w:val="false"/>
+                <w:bCs w:val="false"/>
+                <w:sz w:val="20"/>
+                <w:szCs w:val="20"/>
+              </w:rPr>
+              <w:t xml:space="preserve">1.72</w:t>
+            </w:r>
+          </w:p>
+        </w:tc>
+      </w:tr>
+      <w:tr>
+        <w:trPr>
+          <w:cantSplit/>
+        </w:trPr>
+        <w:tc>
+          <w:tcPr>
+            <w:tcW w:type="dxa" w:w="2200"/>
+            <w:tcBorders>
+              <w:top w:val="single" w:color="000000" w:sz="4"/>
+              <w:left w:val="single" w:color="000000" w:sz="4"/>
+              <w:bottom w:val="single" w:color="000000" w:sz="4"/>
+              <w:right w:val="single" w:color="000000" w:sz="4"/>
+            </w:tcBorders>
+            <w:tcMar>
+              <w:top w:type="dxa" w:w="60"/>
+              <w:left w:type="dxa" w:w="90"/>
+              <w:bottom w:type="dxa" w:w="60"/>
+              <w:right w:type="dxa" w:w="90"/>
+            </w:tcMar>
+          </w:tcPr>
+          <w:p>
+            <w:r>
+              <w:rPr>
+                <w:rFonts w:ascii="Times New Roman" w:cs="Times New Roman" w:eastAsia="Times New Roman" w:hAnsi="Times New Roman"/>
+                <w:b w:val="false"/>
+                <w:bCs w:val="false"/>
+                <w:sz w:val="20"/>
+                <w:szCs w:val="20"/>
+              </w:rPr>
+              <w:t xml:space="preserve">Anchoring: redwood height</w:t>
+            </w:r>
+          </w:p>
+        </w:tc>
+        <w:tc>
+          <w:tcPr>
+            <w:tcW w:type="dxa" w:w="1500"/>
+            <w:tcBorders>
+              <w:top w:val="single" w:color="000000" w:sz="4"/>
+              <w:left w:val="single" w:color="000000" w:sz="4"/>
+              <w:bottom w:val="single" w:color="000000" w:sz="4"/>
+              <w:right w:val="single" w:color="000000" w:sz="4"/>
+            </w:tcBorders>
+            <w:tcMar>
+              <w:top w:type="dxa" w:w="60"/>
+              <w:left w:type="dxa" w:w="90"/>
+              <w:bottom w:type="dxa" w:w="60"/>
+              <w:right w:type="dxa" w:w="90"/>
+            </w:tcMar>
+          </w:tcPr>
+          <w:p>
+            <w:r>
+              <w:rPr>
+                <w:rFonts w:ascii="Times New Roman" w:cs="Times New Roman" w:eastAsia="Times New Roman" w:hAnsi="Times New Roman"/>
+                <w:b w:val="false"/>
+                <w:bCs w:val="false"/>
+                <w:sz w:val="20"/>
+                <w:szCs w:val="20"/>
+              </w:rPr>
+              <w:t xml:space="preserve">1.69</w:t>
+            </w:r>
+          </w:p>
+        </w:tc>
+        <w:tc>
+          <w:tcPr>
+            <w:tcW w:type="dxa" w:w="1900"/>
+            <w:tcBorders>
+              <w:top w:val="single" w:color="000000" w:sz="4"/>
+              <w:left w:val="single" w:color="000000" w:sz="4"/>
+              <w:bottom w:val="single" w:color="000000" w:sz="4"/>
+              <w:right w:val="single" w:color="000000" w:sz="4"/>
+            </w:tcBorders>
+            <w:tcMar>
+              <w:top w:type="dxa" w:w="60"/>
+              <w:left w:type="dxa" w:w="90"/>
+              <w:bottom w:type="dxa" w:w="60"/>
+              <w:right w:type="dxa" w:w="90"/>
+            </w:tcMar>
+          </w:tcPr>
+          <w:p>
+            <w:r>
+              <w:rPr>
+                <w:rFonts w:ascii="Times New Roman" w:cs="Times New Roman" w:eastAsia="Times New Roman" w:hAnsi="Times New Roman"/>
+                <w:b w:val="false"/>
+                <w:bCs w:val="false"/>
+                <w:sz w:val="20"/>
+                <w:szCs w:val="20"/>
+              </w:rPr>
+              <w:t xml:space="preserve">0.21</w:t>
+            </w:r>
+          </w:p>
+        </w:tc>
+        <w:tc>
+          <w:tcPr>
+            <w:tcW w:type="dxa" w:w="1900"/>
+            <w:tcBorders>
+              <w:top w:val="single" w:color="000000" w:sz="4"/>
+              <w:left w:val="single" w:color="000000" w:sz="4"/>
+              <w:bottom w:val="single" w:color="000000" w:sz="4"/>
+              <w:right w:val="single" w:color="000000" w:sz="4"/>
+            </w:tcBorders>
+            <w:tcMar>
+              <w:top w:type="dxa" w:w="60"/>
+              <w:left w:type="dxa" w:w="90"/>
+              <w:bottom w:type="dxa" w:w="60"/>
+              <w:right w:type="dxa" w:w="90"/>
+            </w:tcMar>
+          </w:tcPr>
+          <w:p>
+            <w:r>
+              <w:rPr>
+                <w:rFonts w:ascii="Times New Roman" w:cs="Times New Roman" w:eastAsia="Times New Roman" w:hAnsi="Times New Roman"/>
+                <w:b w:val="false"/>
+                <w:bCs w:val="false"/>
+                <w:sz w:val="20"/>
+                <w:szCs w:val="20"/>
+              </w:rPr>
+              <w:t xml:space="preserve">0.87</w:t>
+            </w:r>
+          </w:p>
+        </w:tc>
+        <w:tc>
+          <w:tcPr>
+            <w:tcW w:type="dxa" w:w="1860"/>
+            <w:tcBorders>
+              <w:top w:val="single" w:color="000000" w:sz="4"/>
+              <w:left w:val="single" w:color="000000" w:sz="4"/>
+              <w:bottom w:val="single" w:color="000000" w:sz="4"/>
+              <w:right w:val="single" w:color="000000" w:sz="4"/>
+            </w:tcBorders>
+            <w:tcMar>
+              <w:top w:type="dxa" w:w="60"/>
+              <w:left w:type="dxa" w:w="90"/>
+              <w:bottom w:type="dxa" w:w="60"/>
+              <w:right w:type="dxa" w:w="90"/>
+            </w:tcMar>
+          </w:tcPr>
+          <w:p>
+            <w:r>
+              <w:rPr>
+                <w:rFonts w:ascii="Times New Roman" w:cs="Times New Roman" w:eastAsia="Times New Roman" w:hAnsi="Times New Roman"/>
+                <w:b w:val="false"/>
+                <w:bCs w:val="false"/>
+                <w:sz w:val="20"/>
+                <w:szCs w:val="20"/>
+              </w:rPr>
+              <w:t xml:space="preserve">2.16</w:t>
+            </w:r>
+          </w:p>
+        </w:tc>
+      </w:tr>
+    </w:tbl>
+    <w:p>
+      <w:pPr>
+        <w:spacing w:after="200"/>
+      </w:pPr>
+    </w:p>
+    <w:p>
+      <w:pPr>
+        <w:spacing w:line="480"/>
+        <w:ind w:firstLine="720"/>
+      </w:pPr>
+      <w:r>
+        <w:rPr>
+          <w:rFonts w:ascii="Times New Roman" w:cs="Times New Roman" w:eastAsia="Times New Roman" w:hAnsi="Times New Roman"/>
+          <w:sz w:val="24"/>
+          <w:szCs w:val="24"/>
+        </w:rPr>
+        <w:t xml:space="preserve">Three patterns emerge. First, for loss framing every specification overstates the human effect, by a factor of about 2.7 to 3.2 (twin d = 2.05 to 2.40 against a human d of 0.76, whose confidence interval spans 0.67 to 0.85). This is consistent with H1(b). Second, anchoring does not show uniform inflation. Under the demographics-only persona both anchoring effects are smaller than the human effects (d = 0.56 against 0.78 for African UN members, and 0.21 against 1.69 for redwood height), because the twins mostly give the same answer under both anchors (a median of 54 UN members under either anchor, the correct value). Richer personas raise the effects, and the Gemini text persona exceeds the human effect on both items (d = 1.72 and 2.16). Third, magnitude fidelity therefore depends on the twin construction method and on whether the item has a known correct answer, which supports reporting results by item and twin architecture instead of pooling them. These pilot results use a single wave of human data as the benchmark and log-transformed estimates for anchoring, and we do not draw inferential conclusions from them.</w:t>
+      </w:r>
+    </w:p>
+    <w:p>
+      <w:pPr>
+        <w:spacing w:line="480"/>
+        <w:ind w:firstLine="720"/>
+      </w:pPr>
+      <w:r>
+        <w:rPr>
+          <w:rFonts w:ascii="Times New Roman" w:cs="Times New Roman" w:eastAsia="Times New Roman" w:hAnsi="Times New Roman"/>
+          <w:sz w:val="24"/>
+          <w:szCs w:val="24"/>
+        </w:rPr>
+        <w:t xml:space="preserve">[The remainder of this section is to be completed after data generation: (i) directional and magnitude recovery for all five phenomena, models, and twin architectures (Figure 1, forest plot of twin-minus-human effect-size differences); (ii) interaction and heterogeneity recovery; (iii) the contamination test for defaults and fairness, with secondary tests for framing and anchoring; (iv) platform-item comparison with meta-analytic intervals and rank-order correlation; (v) training-stage and resource-constraint effects and their covariation with hallucination rates. Each hypothesis should be reported as supported, partially supported, or not supported according to the pre-registered rule, and unsupported hypotheses should be reported with equal prominence. Robustness checks should include alternative prompt templates, alternative effect-size metrics, and exclusion of the most likely contaminated items.]</w:t>
       </w:r>
     </w:p>
     <w:p>

</xml_diff>

<commit_message>
Drop isomorphic and post-cutoff stimuli; contamination contrast uses public canonical vs novel paradigms
Co-Authored-By: Claude Sonnet 5.5 <noreply@anthropic.com>
Claude-Session: https://claude.ai/code/session_01UvKcabfwJpaPKKhavR8Tdw
</commit_message>
<xml_diff>
--- a/ISR_Digital_Twins_Behavioral_Econ_Paper_v3.docx
+++ b/ISR_Digital_Twins_Behavioral_Econ_Paper_v3.docx
@@ -44,7 +44,7 @@
           <w:sz w:val="24"/>
           <w:szCs w:val="24"/>
         </w:rPr>
-        <w:t xml:space="preserve">Large language model (LLM) digital twins are increasingly proposed as low-cost substitutes for human subjects in information systems (IS) research and platform design, yet validation has centered on whether twins reproduce the direction of classic effects. We argue that using twins for design science and theory testing requires theoretical fidelity: recovery of effect magnitudes, moderator interactions, and behavior on stimuli the model cannot have memorized. We develop a pre-registered, contamination-controlled design that evaluates five behavioral economics phenomena (loss framing, defaults, anchoring, decoys, ultimatum-game fairness) across three twin architectures, classic, isomorphic, post-cutoff, and platform stimuli, and model training stage and resource constraints. Human benchmarks come solely from public replications and meta-analyses. We derive six hypotheses and decision rules, and contribute a fidelity framework, a reusable contamination test, and guidance on when synthetic agents may inform platform governance.</w:t>
+        <w:t xml:space="preserve">Large language model (LLM) digital twins are increasingly proposed as low-cost substitutes for human subjects in information systems (IS) research and platform design, yet validation has centered on whether twins reproduce the direction of classic effects. We argue that using twins for design science and theory testing requires theoretical fidelity: recovery of effect magnitudes, moderator interactions, and behavior on stimuli the model cannot have memorized. We develop a pre-registered, contamination-controlled design that evaluates five behavioral economics phenomena (loss framing, defaults, anchoring, decoys, ultimatum-game fairness) across three twin architectures, canonical and novel paradigms, and model training stage and resource constraints. Human benchmarks come solely from public replications, public experiments run after the twins were built, and meta-analyses. We derive six hypotheses and decision rules, and contribute a fidelity framework, a reusable contamination test, and guidance on when synthetic agents may inform platform governance.</w:t>
       </w:r>
     </w:p>
     <w:p>
@@ -167,7 +167,7 @@
           <w:sz w:val="24"/>
           <w:szCs w:val="24"/>
         </w:rPr>
-        <w:t xml:space="preserve">: whether they recover the magnitude, moderator structure, and boundary conditions that behavioral theory implies, on stimuli whose surface form is unlikely to appear in training data. We define theoretical fidelity along four separable dimensions (direction, magnitude, condition-dependence, and contamination-robustness) and develop a pre-registered design that measures each against public human benchmarks. The design covers five phenomena chosen for their effect-size literatures, differing replicability records, and relevance to platforms; three twin architectures; four stimulus classes; and variation in model training stage and inference-time resource constraints.</w:t>
+        <w:t xml:space="preserve">: whether they recover the magnitude, moderator structure, and boundary conditions that behavioral theory implies, on paradigms whose exact form is unlikely to appear in training data. We define theoretical fidelity along four separable dimensions (direction, magnitude, condition-dependence, and contamination-robustness) and develop a pre-registered design that measures each against public human benchmarks. The design covers five phenomena chosen for their effect-size literatures, differing replicability records, and relevance to platforms; three twin architectures; two classes of paradigms (canonical and novel); and variation in model training stage and inference-time resource constraints.</w:t>
       </w:r>
     </w:p>
     <w:p>
@@ -217,7 +217,7 @@
           <w:sz w:val="24"/>
           <w:szCs w:val="24"/>
         </w:rPr>
-        <w:t xml:space="preserve">, built on structurally isomorphic and post-training-cutoff stimuli with a pre-specified contamination test, that later studies can reuse as models change. Third, it offers a </w:t>
+        <w:t xml:space="preserve">, built on a contrast between canonical paradigms and novel paradigms with public human data, with a pre-specified contamination test, that later studies can reuse as models change. Third, it offers a </w:t>
       </w:r>
       <w:r>
         <w:rPr>
@@ -658,7 +658,7 @@
           <w:sz w:val="24"/>
           <w:szCs w:val="24"/>
         </w:rPr>
-        <w:t xml:space="preserve">Contamination is not merely a methodological nuisance. It is a threat to any claim that a model has internalized a behavioral mechanism. Large models can reproduce verbatim training sequences, and larger models memorize more (Carlini et al. 2021, 2023). If classic materials appear in the training corpus, recovery of the original effect on those materials is consistent with both genuine generalization and memorization. Two designs separate the possibilities: structurally isomorphic stimuli that preserve the theoretical contrast while rewriting cover stories, numbers, and context, and experiments published after known training cutoffs. The inference is only valid if the attenuation expected from stimulus change alone is accounted for, a point we address in Section 3.5.</w:t>
+        <w:t xml:space="preserve">Contamination is not merely a methodological nuisance. It is a threat to any claim that a model has internalized a behavioral mechanism. Large models can reproduce verbatim training sequences, and larger models memorize more (Carlini et al. 2021, 2023). If classic materials appear in the training corpus, recovery of the original effect on those materials is consistent with both genuine generalization and memorization. A contrast between canonical paradigms and novel paradigms separates the possibilities. Novel paradigms preserve the theoretical contrast but use new cover stories and materials, and those collected after the twins were built could not have been seen in training. The inference is valid only if the difference between paradigms observed in humans is accounted for, a point we address in Section 3.5.</w:t>
       </w:r>
     </w:p>
     <w:p>
@@ -691,7 +691,7 @@
           <w:sz w:val="24"/>
           <w:szCs w:val="24"/>
         </w:rPr>
-        <w:t xml:space="preserve">Interface designers act as choice architects (Thaler and Sunstein 2008). Schneider et al. (2018) and Weinmann et al. (2016) formalize digital nudging as the use of interface elements (defaults, ordering, framing, decoys) to guide behavior, and dark patterns represent the manipulative extreme of this practice (Mathur et al. 2019). These interventions are ubiquitous yet differ in surface features from laboratory materials. Whether twins recover the rank order and absolute magnitudes of platform effects relative to field experiments is therefore a stronger test of fidelity than classic-item recovery, and a failure would imply that twins cannot yet forecast the consequences of design choices that matter most to IS practice.</w:t>
+        <w:t xml:space="preserve">Interface designers act as choice architects (Thaler and Sunstein 2008). Schneider et al. (2018) and Weinmann et al. (2016) formalize digital nudging as the use of interface elements (defaults, ordering, framing, decoys) to guide behavior, and dark patterns represent the manipulative extreme of this practice (Mathur et al. 2019). These interventions are ubiquitous yet differ in surface features from laboratory materials. Whether twins recover the magnitudes of platform effects relative to field experiments is therefore a stronger test of fidelity than classic-item recovery, and a failure would imply that twins cannot yet forecast the consequences of design choices that matter most to IS practice.</w:t>
       </w:r>
     </w:p>
     <w:p>
@@ -724,7 +724,7 @@
           <w:sz w:val="24"/>
           <w:szCs w:val="24"/>
         </w:rPr>
-        <w:t xml:space="preserve">We pose five research questions: (RQ1) Do twins reproduce the direction and approximate magnitude of theoretically predicted effects? (RQ2) Do they reproduce predicted moderator interactions? (RQ3) Are effects attenuated on isomorphic and post-cutoff stimuli, beyond what is observed in humans? (RQ4) Do twin-generated effect sizes for platform interventions fall within field and meta-analytic ranges? (RQ5) How do bias magnitudes vary with training stage and resource constraints, and do they co-move with hallucination rates? The hypotheses below are pre-registered; operational definitions and decision rules appear in Table 1 and Section 3.5.</w:t>
+        <w:t xml:space="preserve">We pose five research questions: (RQ1) Do twins reproduce the direction and approximate magnitude of theoretically predicted effects? (RQ2) Do they reproduce predicted moderator interactions? (RQ3) Is the twin–human discrepancy larger on canonical than on novel paradigms? (RQ4) Do twin-generated effect sizes for platform-relevant interventions fall within meta-analytic ranges? (RQ5) How do bias magnitudes vary with training stage and resource constraints, and do they co-move with hallucination rates? The hypotheses below are pre-registered; operational definitions and decision rules appear in Table 1 and Section 3.5.</w:t>
       </w:r>
     </w:p>
     <w:p>
@@ -790,7 +790,7 @@
           <w:sz w:val="24"/>
           <w:szCs w:val="24"/>
         </w:rPr>
-        <w:t xml:space="preserve"> Effects on isomorphic stimuli will be smaller than on classic stimuli by more than the attenuation observed in human data. </w:t>
+        <w:t xml:space="preserve"> The twin–human discrepancy in effect size will be larger on canonical paradigms than on novel paradigms. </w:t>
       </w:r>
       <w:r>
         <w:rPr>
@@ -808,7 +808,7 @@
           <w:sz w:val="24"/>
           <w:szCs w:val="24"/>
         </w:rPr>
-        <w:t xml:space="preserve"> if recovery partly reflects memorization of surface form, it should not transfer fully to rewritten stimuli (Section 2.4). Peng et al. (2026) report consistent preliminary evidence for defaults, and the public data show why classic paradigms are informative: the human organ-donation default effect is near zero in this sample (d ≈ 0.10), whereas twins show a strong effect, a pattern that memorization of the original finding would produce. We test this across all five phenomena.</w:t>
+        <w:t xml:space="preserve"> if recovery partly reflects memorization of the original materials, the excess should be concentrated in canonical paradigms and should not transfer to new ones (Section 2.4). Peng et al. (2026) report consistent preliminary evidence for defaults, and the public data show why classic paradigms are informative: the human organ-donation default effect is near zero in this sample (d ≈ 0.10), whereas twins show a strong effect, a pattern that memorization of the original finding would produce. We test this across all five phenomena.</w:t>
       </w:r>
     </w:p>
     <w:p>
@@ -908,15 +908,15 @@
           <w:sz w:val="24"/>
           <w:szCs w:val="24"/>
         </w:rPr>
-        <w:t xml:space="preserve">H5 (Platform ordering).</w:t>
-      </w:r>
-      <w:r>
-        <w:rPr>
-          <w:rFonts w:ascii="Times New Roman" w:cs="Times New Roman" w:eastAsia="Times New Roman" w:hAnsi="Times New Roman"/>
-          <w:sz w:val="24"/>
-          <w:szCs w:val="24"/>
-        </w:rPr>
-        <w:t xml:space="preserve"> The rank order of platform design effects produced by twins will correlate positively with the meta-analytic rank order, but absolute twin effects will fall outside meta-analytic confidence intervals more often than the nominal rate. The direction of error is not constrained ex ante: overestimation is expected for canonical paradigms and underestimation for effects that require non-normative responses, and we report this as a pre-specified secondary analysis. </w:t>
+        <w:t xml:space="preserve">H5 (Meta-analytic calibration).</w:t>
+      </w:r>
+      <w:r>
+        <w:rPr>
+          <w:rFonts w:ascii="Times New Roman" w:cs="Times New Roman" w:eastAsia="Times New Roman" w:hAnsi="Times New Roman"/>
+          <w:sz w:val="24"/>
+          <w:szCs w:val="24"/>
+        </w:rPr>
+        <w:t xml:space="preserve"> Twin effect sizes for platform-relevant interventions (defaults, anchoring, framing, decoys) will fall outside the corresponding meta-analytic confidence intervals more often than the nominal rate. The direction of error is not constrained ex ante: overestimation is expected for canonical paradigms and underestimation for effects that require non-normative responses, and we report this as a pre-specified secondary analysis. </w:t>
       </w:r>
       <w:r>
         <w:rPr>
@@ -934,7 +934,7 @@
           <w:sz w:val="24"/>
           <w:szCs w:val="24"/>
         </w:rPr>
-        <w:t xml:space="preserve"> rank order reflects the qualitative structure of theory that models have learned, whereas magnitudes depend on field conditions (attention, competing options, stakes) that text-based twins do not experience.</w:t>
+        <w:t xml:space="preserve"> magnitudes depend on field conditions (attention, competing options, stakes) that text-based twins do not experience.</w:t>
       </w:r>
     </w:p>
     <w:p>
@@ -1080,7 +1080,7 @@
           <w:sz w:val="24"/>
           <w:szCs w:val="24"/>
         </w:rPr>
-        <w:t xml:space="preserve"> name the relevant behavioral principle and serve as a leakage check: if naming the theory changes results markedly, then implicit recovery was incomplete. Four to five frontier models from distinct families are queried [model identifiers, versions, and access dates to be listed in Appendix A]. Multiple stochastic draws per item characterize response distributions, and the number of draws is set by the power analysis in Section 3.5.</w:t>
+        <w:t xml:space="preserve"> name the relevant behavioral principle and serve as a leakage check: if naming the theory changes results markedly, then implicit recovery was incomplete. Four to five frontier models from distinct families are queried [model identifiers, versions, and access dates to be listed in Appendix A]. Multiple stochastic draws per item characterize response distributions, and the number of draws is set by the power analysis in Section 3.5. Training cutoffs for each model are listed in Appendix A, because the mega-study data became public in September 2025 and may predate the cutoffs of the later models, which would weaken the contamination contrast for them.</w:t>
       </w:r>
     </w:p>
     <w:p>
@@ -1113,7 +1113,7 @@
           <w:sz w:val="24"/>
           <w:szCs w:val="24"/>
         </w:rPr>
-        <w:t xml:space="preserve">Four stimulus classes are used. (1) </w:t>
+        <w:t xml:space="preserve">Two classes of paradigms are used, and all come from public human datasets; we construct no new stimuli. (1) </w:t>
       </w:r>
       <w:r>
         <w:rPr>
@@ -1123,15 +1123,15 @@
           <w:sz w:val="24"/>
           <w:szCs w:val="24"/>
         </w:rPr>
-        <w:t xml:space="preserve">Classic items</w:t>
-      </w:r>
-      <w:r>
-        <w:rPr>
-          <w:rFonts w:ascii="Times New Roman" w:cs="Times New Roman" w:eastAsia="Times New Roman" w:hAnsi="Times New Roman"/>
-          <w:sz w:val="24"/>
-          <w:szCs w:val="24"/>
-        </w:rPr>
-        <w:t xml:space="preserve"> from the original literature carry the highest contamination risk. (2) </w:t>
+        <w:t xml:space="preserve">Canonical paradigms</w:t>
+      </w:r>
+      <w:r>
+        <w:rPr>
+          <w:rFonts w:ascii="Times New Roman" w:cs="Times New Roman" w:eastAsia="Times New Roman" w:hAnsi="Times New Roman"/>
+          <w:sz w:val="24"/>
+          <w:szCs w:val="24"/>
+        </w:rPr>
+        <w:t xml:space="preserve"> come from the original literature and carry the highest contamination risk: the organ-donation default, the gain/loss framing problem, the numerical anchoring items, and the ultimatum game. (2) </w:t>
       </w:r>
       <w:r>
         <w:rPr>
@@ -1141,51 +1141,15 @@
           <w:sz w:val="24"/>
           <w:szCs w:val="24"/>
         </w:rPr>
-        <w:t xml:space="preserve">Structurally isomorphic items</w:t>
-      </w:r>
-      <w:r>
-        <w:rPr>
-          <w:rFonts w:ascii="Times New Roman" w:cs="Times New Roman" w:eastAsia="Times New Roman" w:hAnsi="Times New Roman"/>
-          <w:sz w:val="24"/>
-          <w:szCs w:val="24"/>
-        </w:rPr>
-        <w:t xml:space="preserve"> preserve the theoretical contrast while rewriting cover stories, numbers, and contexts under a documented rewriting protocol. (3) </w:t>
-      </w:r>
-      <w:r>
-        <w:rPr>
-          <w:rFonts w:ascii="Times New Roman" w:cs="Times New Roman" w:eastAsia="Times New Roman" w:hAnsi="Times New Roman"/>
-          <w:i/>
-          <w:iCs/>
-          <w:sz w:val="24"/>
-          <w:szCs w:val="24"/>
-        </w:rPr>
-        <w:t xml:space="preserve">Post-cutoff items</w:t>
-      </w:r>
-      <w:r>
-        <w:rPr>
-          <w:rFonts w:ascii="Times New Roman" w:cs="Times New Roman" w:eastAsia="Times New Roman" w:hAnsi="Times New Roman"/>
-          <w:sz w:val="24"/>
-          <w:szCs w:val="24"/>
-        </w:rPr>
-        <w:t xml:space="preserve"> are drawn from pre-registered experiments published after the training cutoffs of the evaluated models. (4) </w:t>
-      </w:r>
-      <w:r>
-        <w:rPr>
-          <w:rFonts w:ascii="Times New Roman" w:cs="Times New Roman" w:eastAsia="Times New Roman" w:hAnsi="Times New Roman"/>
-          <w:i/>
-          <w:iCs/>
-          <w:sz w:val="24"/>
-          <w:szCs w:val="24"/>
-        </w:rPr>
-        <w:t xml:space="preserve">Platform items</w:t>
-      </w:r>
-      <w:r>
-        <w:rPr>
-          <w:rFonts w:ascii="Times New Roman" w:cs="Times New Roman" w:eastAsia="Times New Roman" w:hAnsi="Times New Roman"/>
-          <w:sz w:val="24"/>
-          <w:szCs w:val="24"/>
-        </w:rPr>
-        <w:t xml:space="preserve"> are newly constructed to represent subscription defaults, price anchors in recommendation interfaces, decoy products, recommendation order, and dark-pattern variants. Platform items are matched to the conditions of existing meta-analyses (for example, opt-in versus opt-out and the type of default), and only items that can be mapped to a meta-analytic category are retained.</w:t>
+        <w:t xml:space="preserve">Novel paradigms</w:t>
+      </w:r>
+      <w:r>
+        <w:rPr>
+          <w:rFonts w:ascii="Times New Roman" w:cs="Times New Roman" w:eastAsia="Times New Roman" w:hAnsi="Times New Roman"/>
+          <w:sz w:val="24"/>
+          <w:szCs w:val="24"/>
+        </w:rPr>
+        <w:t xml:space="preserve"> test the same theoretical contrasts with different materials: the green-energy default, the newly built product choice sets for the attraction effect, and the targeting-fairness study, all collected after the twins were built (Peng et al. 2026). Platform relevance is represented by the settings of these paradigms (defaults in service enrollment, choices among online products, targeted advertising) and by comparison with meta-analyses of field effects. Table 2 lists the paradigms by phenomenon.</w:t>
       </w:r>
     </w:p>
     <w:p>
@@ -1251,7 +1215,7 @@
           <w:sz w:val="24"/>
           <w:szCs w:val="24"/>
         </w:rPr>
-        <w:t xml:space="preserve">No new human-subject data are collected. Table 2 maps each phenomenon to its public human benchmarks. Item-level benchmarks come from two public datasets: Twin-2K-500, whose 2,058 US participants completed four waves, including classic heuristics-and-biases experiments and a repeat wave that provides a human test–retest ceiling (Toubia et al. 2025), and the Twin-2K-500 mega-study, whose 19 pre-registered studies collected new human responses after the twins were built, including studies of the attraction effect, defaults, and fairness (Peng et al. 2026). The mega-study’s human data are particularly valuable for contamination because they come from stimuli, such as newly developed choice sets, that twins could not have seen during training. Replication datasets from Many Labs (Klein et al. 2014, 2018) and published meta-analyses supply additional benchmarks for classic effects, and platform items are evaluated against pooled effect sizes and confidence intervals from field experiments and meta-analyses (for example, Jachimowicz et al. 2019 for defaults). Benchmarks are matched to cells only when the paradigm can be mapped, and every source is listed with its version in Appendix C. All prompts, model outputs, and code will be deposited in a public repository.</w:t>
+        <w:t xml:space="preserve">No new human-subject data are collected. Table 2 maps each phenomenon to its public human benchmarks. Item-level benchmarks come from two public datasets: Twin-2K-500, whose 2,058 US participants completed four waves, including classic heuristics-and-biases experiments and a repeat wave that provides a human test–retest ceiling (Toubia et al. 2025), and the Twin-2K-500 mega-study, whose 19 pre-registered studies collected new human responses after the twins were built, including studies of the attraction effect, defaults, and fairness (Peng et al. 2026). The mega-study’s human data are particularly valuable for contamination because they come from stimuli, such as newly developed choice sets, that twins could not have seen during training. Replication datasets from Many Labs (Klein et al. 2014, 2018) and published meta-analyses supply additional benchmarks for classic effects, and platform-relevant paradigms are evaluated against pooled effect sizes and confidence intervals from field experiments and meta-analyses (for example, Jachimowicz et al. 2019 for defaults). Benchmarks are matched to cells only when the paradigm can be mapped, and every source is listed with its version in Appendix C. All prompts, model outputs, and code will be deposited in a public repository.</w:t>
       </w:r>
     </w:p>
     <w:p>
@@ -2043,7 +2007,7 @@
           <w:sz w:val="24"/>
           <w:szCs w:val="24"/>
         </w:rPr>
-        <w:t xml:space="preserve">The Twin-2K-500 repeat wave shows that these human effects are stable on retest, which gives a human noise ceiling for the magnitude comparison. Benchmark values in Table 2 were computed by the authors from the public mega-study data with a script deposited with the paper (Appendix C), coding conditions from the displayed survey text. Coverage is uneven, as Table 2 shows. For loss framing and anchoring, public data contain the classic paradigms but no matched novel paradigms, so the contamination test (H2) for those phenomena relies on published tests of context variation and is reported as secondary. The contamination test is primary for defaults and fairness, where both a classic and a novel paradigm have human data. For decoys only novel stimuli have human data, so twin performance there tests fidelity on unseen stimuli but cannot be framed as a classic-versus-novel contrast.</w:t>
+        <w:t xml:space="preserve">The Twin-2K-500 repeat wave shows that these human effects are stable on retest, which gives a human noise ceiling for the magnitude comparison. Benchmark values in Table 2 were computed by the authors from the public mega-study data with a script deposited with the paper (Appendix C), coding conditions from the displayed survey text. Coverage is uneven, as Table 2 shows. For loss framing and anchoring, public data contain only canonical paradigms, so the contamination test (H2) cannot be run for them and their results are descriptive. The contamination test is possible for defaults and fairness, where both a canonical and a novel paradigm have human data. For decoys only a novel paradigm has human data, so twin performance there tests fidelity on unseen materials but cannot be framed as a canonical-versus-novel contrast. We construct no new or post-training-cutoff stimuli, and the contamination analysis is limited accordingly.</w:t>
       </w:r>
     </w:p>
     <w:p>
@@ -2166,7 +2130,7 @@
           <w:sz w:val="24"/>
           <w:szCs w:val="24"/>
         </w:rPr>
-        <w:t xml:space="preserve"> is the difference-in-differences Δ = (d_twin,iso − d_twin,classic) − (d_human,iso − d_human,classic), where the human term is estimated from published tests of cover-story and context variation in the benchmark literature. A ratio of effects (novel/classic) is reported as a secondary descriptive index, because it is unstable when the classic effect is small. A negative Δ with a confidence interval excluding zero supports H2.</w:t>
+        <w:t xml:space="preserve"> is the difference-in-differences Δ = (d_twin,novel − d_human,novel) − (d_twin,canonical − d_human,canonical), where both human terms are observed in the public data. A ratio of effects (novel/canonical) is reported as a secondary descriptive index, because it is unstable when the canonical effect is small. A negative Δ with a confidence interval excluding zero supports H2.</w:t>
       </w:r>
     </w:p>
     <w:p>
@@ -2529,7 +2493,7 @@
                 <w:sz w:val="20"/>
                 <w:szCs w:val="20"/>
               </w:rPr>
-              <w:t xml:space="preserve">Difference-in-differences Δ (Section 3.5), classic vs. isomorphic and post-cutoff items</w:t>
+              <w:t xml:space="preserve">Difference-in-differences Δ (Section 3.5), canonical vs. novel paradigms</w:t>
             </w:r>
           </w:p>
         </w:tc>
@@ -2892,7 +2856,7 @@
                 <w:sz w:val="20"/>
                 <w:szCs w:val="20"/>
               </w:rPr>
-              <w:t xml:space="preserve">Spearman rank correlation with meta-analytic effects; coverage of meta-analytic CIs</w:t>
+              <w:t xml:space="preserve">Coverage of meta-analytic CIs by twin effect sizes</w:t>
             </w:r>
           </w:p>
         </w:tc>
@@ -2921,7 +2885,7 @@
                 <w:sz w:val="20"/>
                 <w:szCs w:val="20"/>
               </w:rPr>
-              <w:t xml:space="preserve">ρ &gt; 0 with CI excluding 0; share of twin effects within CI</w:t>
+              <w:t xml:space="preserve">Share of twin effects within the CI, compared with the nominal 95%</w:t>
             </w:r>
           </w:p>
         </w:tc>
@@ -2950,7 +2914,7 @@
                 <w:sz w:val="20"/>
                 <w:szCs w:val="20"/>
               </w:rPr>
-              <w:t xml:space="preserve">Positive ρ and coverage below nominal</w:t>
+              <w:t xml:space="preserve">Coverage below nominal</w:t>
             </w:r>
           </w:p>
         </w:tc>
@@ -3811,7 +3775,7 @@
           <w:sz w:val="24"/>
           <w:szCs w:val="24"/>
         </w:rPr>
-        <w:t xml:space="preserve">[The remainder of this section is to be completed after data generation: (i) directional and magnitude recovery for all five phenomena, models, and twin architectures (Figure 1, forest plot of twin-minus-human effect-size differences); (ii) interaction and heterogeneity recovery; (iii) the contamination test for defaults and fairness, with secondary tests for framing and anchoring; (iv) platform-item comparison with meta-analytic intervals and rank-order correlation; (v) training-stage and resource-constraint effects and their covariation with hallucination rates. Each hypothesis should be reported as supported, partially supported, or not supported according to the pre-registered rule, and unsupported hypotheses should be reported with equal prominence. Robustness checks should include alternative prompt templates, alternative effect-size metrics, and exclusion of the most likely contaminated items.]</w:t>
+        <w:t xml:space="preserve">[The remainder of this section is to be completed after data generation: (i) directional and magnitude recovery for all five phenomena, models, and twin architectures (Figure 1, forest plot of twin-minus-human effect-size differences); (ii) interaction and heterogeneity recovery; (iii) the contamination test for defaults and fairness, with descriptive results for framing, anchoring, and decoys; (iv) calibration against meta-analytic intervals; (v) training-stage and resource-constraint effects and their covariation with hallucination rates. Each hypothesis should be reported as supported, partially supported, or not supported according to the pre-registered rule, and unsupported hypotheses should be reported with equal prominence. Robustness checks should include alternative prompt templates, alternative effect-size metrics, and exclusion of the most likely contaminated items.]</w:t>
       </w:r>
     </w:p>
     <w:p>
@@ -3925,7 +3889,7 @@
           <w:sz w:val="24"/>
           <w:szCs w:val="24"/>
         </w:rPr>
-        <w:t xml:space="preserve">Several limitations bound the inferences. First, the platform items are matched to meta-analytic categories but not to the specific populations, stakes, and attention conditions of real platforms, so tests against meta-analytic intervals assess the plausibility of effect sizes, not their predictive accuracy for a given site. Second, public human data for novel paradigms exist only for some phenomena (Table 2). For loss framing and anchoring the contamination test rests on the assumption that human attenuation under cover-story change is captured by the published context-variation literature. We report these results as secondary. In addition, both item-level datasets draw on US online panels, so conclusions about fidelity are conditional on that population. Third, contamination control is necessarily incomplete, since training corpora are undisclosed and isomorphic items may still resemble training text. Fourth, models change rapidly, so results describe specific model versions, and we provide the design and code precisely so that tests can be repeated. Fifth, the human literature itself has known replicability problems, which we address through benchmark uncertainty and the strong/weak replication split. Finally, evidence of functional similarity between LLMs and human cognition does not establish common mechanisms.</w:t>
+        <w:t xml:space="preserve">Several limitations bound the inferences. First, the platform-relevant paradigms are matched to meta-analytic categories but not to the specific populations, stakes, and attention conditions of real platforms, so tests against meta-analytic intervals assess the plausibility of effect sizes, not their predictive accuracy for a given site. Second, public human data for novel paradigms exist only for defaults, decoys, and fairness (Table 2). We construct no isomorphic or post-training-cutoff stimuli, so the contamination test is unavailable for framing and anchoring, and for the later models in our sample the mega-study data may fall inside their training period (Section 3.1). We report these limits alongside the results. In addition, both item-level datasets draw on US online panels, so conclusions about fidelity are conditional on that population. Third, contamination control is necessarily incomplete, since training corpora are undisclosed and novel paradigms may still resemble training text. Fourth, models change rapidly, so results describe specific model versions, and we provide the design and code precisely so that tests can be repeated. Fifth, the human literature itself has known replicability problems, which we address through benchmark uncertainty and the strong/weak replication split. Finally, evidence of functional similarity between LLMs and human cognition does not establish common mechanisms.</w:t>
       </w:r>
     </w:p>
     <w:p>

</xml_diff>